<commit_message>
Agrego informe modificado omitido en commit anterior
</commit_message>
<xml_diff>
--- a/informe proyecto/Informe Mira - LLM.docx
+++ b/informe proyecto/Informe Mira - LLM.docx
@@ -261,7 +261,11 @@
     <w:sdt>
       <w:sdtPr>
         <w:rPr>
-          <w:lang w:val="es-ES"/>
+          <w:rFonts w:ascii="Calibri" w:eastAsia="Calibri" w:hAnsi="Calibri" w:cs="Calibri"/>
+          <w:color w:val="auto"/>
+          <w:sz w:val="22"/>
+          <w:szCs w:val="22"/>
+          <w:lang w:val="es-ES" w:eastAsia="es-ES_tradnl"/>
         </w:rPr>
         <w:id w:val="2051031036"/>
         <w:docPartObj>
@@ -271,13 +275,8 @@
       </w:sdtPr>
       <w:sdtEndPr>
         <w:rPr>
-          <w:rFonts w:ascii="Calibri" w:eastAsia="Calibri" w:hAnsi="Calibri" w:cs="Calibri"/>
           <w:b/>
           <w:bCs/>
-          <w:color w:val="auto"/>
-          <w:sz w:val="22"/>
-          <w:szCs w:val="22"/>
-          <w:lang w:eastAsia="es-ES_tradnl"/>
         </w:rPr>
       </w:sdtEndPr>
       <w:sdtContent>
@@ -2121,7 +2120,19 @@
         <w:spacing w:after="160" w:line="278" w:lineRule="auto"/>
       </w:pPr>
       <w:r>
-        <w:t>…..</w:t>
+        <w:t xml:space="preserve">DPRIME enfrenta un problema estructural en su modelo de negocio: aunque ha ejecutado exitosamente proyectos de automatización para aseguradoras, bancos y operadores logísticos, cada nuevo cliente requiere una solución construida desde cero, lo que limita la escalabilidad. MIRA busca convertir esa experiencia en una plataforma productiva, pero la versión actual es una demostración que no soporta operación autónoma, </w:t>
+      </w:r>
+      <w:r>
+        <w:t>control de versiones</w:t>
+      </w:r>
+      <w:r>
+        <w:t xml:space="preserve"> ni facturación confiable. Este análisis se realizó a partir de nueve entrevistas de levantamiento con el equipo interno y la aseguradora piloto, y arrojó tres hallazgos principales: primero, la plataforma actual no permite operar sin la intervención constante de ingenieros de DPRIME, lo que contradice el modelo de autoservicio prometido; segundo, el motor de análisis no es el cuello de botella, sino la confianza del usuario, la conformidad legal y la calidad de la evidencia de entrada, aspectos que el sistema actual no aborda; tercero, no existe una definición operativa de "validación" ni un registro confiable de uso, lo que inviabiliza el modelo de cobro al éxito. Se recomienda priorizar el desarrollo del diseñador de flujos con </w:t>
+      </w:r>
+      <w:r>
+        <w:t>un control de versiones</w:t>
+      </w:r>
+      <w:r>
+        <w:t>, la bandeja de revisión asistida que muestre explícitamente la razón de derivación, y el módulo de medición de consumo con criterios claros acordados con el cliente piloto, antes de avanzar en capacidades complementarias como análisis de audio o aplicación móvil.</w:t>
       </w:r>
       <w:r>
         <w:br w:type="page"/>
@@ -2157,14 +2168,33 @@
       <w:pPr>
         <w:spacing w:after="160" w:line="278" w:lineRule="auto"/>
       </w:pPr>
+      <w:r>
+        <w:br/>
+      </w:r>
+      <w:r>
+        <w:t>El presente documento describe la necesidad de construir MIRA, una plataforma de inteligencia artificial multimodal para la toma de decisiones empresariales automatizadas y trazables, desarrollada por DPRIME SpA para el sector asegurador, financiero y logístico. El análisis se basa en la experiencia acumulada por DPRIME desde 2019 como consultora de automatización y visión computacional, así como en los aprendizajes de tres pilotos ejecutados entre 2025 y el primer semestre de 2026. El alcance de este documento es el levantamiento inicial de requerimientos para la versión productiva de MIRA, que debe permitir a los clientes operar la plataforma de forma autónoma, registrar y auditar decisiones, y facturar el uso sin intervención manual.</w:t>
+      </w:r>
     </w:p>
     <w:p>
       <w:pPr>
         <w:spacing w:after="160" w:line="278" w:lineRule="auto"/>
       </w:pPr>
       <w:r>
-        <w:t>…….</w:t>
+        <w:t>El documento fue redactado por la Dirección de Producto a partir de conversaciones con el equipo interno de DPRIME y con la aseguradora que participa como cliente piloto. El equipo está compuesto por Rodrigo Vergara, socio fundador y gerente general de DPRIME y patrocinador del proyecto; Camila Ordóñez, directora de producto; Sebastián Alarcón, líder de ingeniería de modelos; Valentina Ruiz-Tagle, encargada de administración y finanzas; Tomás Berríos, encargado de operación y soporte; y el equipo de desarrollo. El representante del cliente en esta entrega es Francisca Leiva, subgerenta de operaciones de siniestros de la aseguradora piloto. El análisis parte de la premisa de que este documento describe una necesidad y no una especificación formal de requisitos, y que las discrepancias entre el documento y las entrevistas deben ser resueltas por el equipo de desarrollo.</w:t>
       </w:r>
+    </w:p>
+    <w:p>
+      <w:pPr>
+        <w:spacing w:after="160" w:line="278" w:lineRule="auto"/>
+      </w:pPr>
+      <w:r>
+        <w:t>El propósito de este documento es establecer un punto de partida para el diseño y construcción de la plataforma MIRA, organizando cuatro entregas entre septiembre de 2026 y abril de 2027, con una marcha blanca programada para el proceso de reembolso de gastos médicos del cliente piloto. La plataforma debe estar disponible de forma permanente, ofrecer un tiempo de respuesta promedio de 2,3 segundos por caso en condiciones óptimas, soportar un volumen inicial estimado de dos mil casos mensuales y manejar evidencia multimodal: documentos, imágenes, video, audio y códigos impresos </w:t>
+      </w:r>
+    </w:p>
+    <w:p>
+      <w:pPr>
+        <w:spacing w:after="160" w:line="278" w:lineRule="auto"/>
+      </w:pPr>
       <w:r>
         <w:br w:type="page"/>
       </w:r>
@@ -2202,6 +2232,7 @@
           <w:ilvl w:val="1"/>
           <w:numId w:val="5"/>
         </w:numPr>
+        <w:spacing w:line="240" w:lineRule="auto"/>
         <w:ind w:left="567" w:hanging="567"/>
         <w:rPr>
           <w:rFonts w:ascii="Calibri" w:hAnsi="Calibri" w:cs="Calibri"/>
@@ -2286,9 +2317,9 @@
           <w14:ligatures w14:val="standardContextual"/>
         </w:rPr>
         <w:drawing>
-          <wp:inline distT="0" distB="0" distL="0" distR="0" wp14:anchorId="3E3BE5EE" wp14:editId="7DA3C5B3">
-            <wp:extent cx="5612130" cy="3270964"/>
-            <wp:effectExtent l="19050" t="19050" r="26670" b="24765"/>
+          <wp:inline distT="0" distB="0" distL="0" distR="0" wp14:anchorId="3E3BE5EE" wp14:editId="783B6962">
+            <wp:extent cx="5784850" cy="3054350"/>
+            <wp:effectExtent l="19050" t="19050" r="25400" b="12700"/>
             <wp:docPr id="439486876" name="Imagen 1"/>
             <wp:cNvGraphicFramePr>
               <a:graphicFrameLocks xmlns:a="http://schemas.openxmlformats.org/drawingml/2006/main" noChangeAspect="1"/>
@@ -2315,7 +2346,7 @@
                   <pic:spPr>
                     <a:xfrm>
                       <a:off x="0" y="0"/>
-                      <a:ext cx="5612130" cy="3270964"/>
+                      <a:ext cx="5800678" cy="3062707"/>
                     </a:xfrm>
                     <a:prstGeom prst="rect">
                       <a:avLst/>
@@ -2340,6 +2371,7 @@
           <w:ilvl w:val="2"/>
           <w:numId w:val="5"/>
         </w:numPr>
+        <w:spacing w:line="240" w:lineRule="auto"/>
         <w:rPr>
           <w:b/>
           <w:bCs/>
@@ -3717,7 +3749,6 @@
                 <w:sz w:val="16"/>
                 <w:szCs w:val="16"/>
               </w:rPr>
-              <w:lastRenderedPageBreak/>
               <w:t>Plantilla</w:t>
             </w:r>
           </w:p>
@@ -3793,12 +3824,6 @@
         </w:tc>
       </w:tr>
     </w:tbl>
-    <w:p>
-      <w:pPr>
-        <w:spacing w:after="0" w:line="360" w:lineRule="auto"/>
-        <w:ind w:left="1418"/>
-      </w:pPr>
-    </w:p>
     <w:p/>
     <w:p>
       <w:pPr>
@@ -5007,6 +5032,9 @@
   </w:num>
   <w:num w:numId="5" w16cid:durableId="254673929">
     <w:abstractNumId w:val="2"/>
+  </w:num>
+  <w:num w:numId="6" w16cid:durableId="345711229">
+    <w:abstractNumId w:val="4"/>
   </w:num>
 </w:numbering>
 </file>
@@ -6087,7 +6115,7 @@
     <w:rsid w:val="009146BD"/>
     <w:pPr>
       <w:numPr>
-        <w:numId w:val="3"/>
+        <w:numId w:val="6"/>
       </w:numPr>
     </w:pPr>
   </w:style>

</xml_diff>

<commit_message>
Actualizacion y adicion de información sobre tecnicas de prompting
</commit_message>
<xml_diff>
--- a/informe proyecto/Informe Mira - LLM.docx
+++ b/informe proyecto/Informe Mira - LLM.docx
@@ -82,7 +82,7 @@
           <w:sz w:val="28"/>
           <w:szCs w:val="28"/>
         </w:rPr>
-        <w:t>Nombre 1</w:t>
+        <w:t>Lester Gonzales</w:t>
       </w:r>
       <w:r>
         <w:br/>
@@ -101,19 +101,7 @@
           <w:sz w:val="28"/>
           <w:szCs w:val="28"/>
         </w:rPr>
-        <w:t xml:space="preserve">Nombre 2 </w:t>
-      </w:r>
-      <w:r>
-        <w:br/>
-      </w:r>
-      <w:r>
-        <w:tab/>
-      </w:r>
-      <w:r>
-        <w:tab/>
-      </w:r>
-      <w:r>
-        <w:t xml:space="preserve"> </w:t>
+        <w:t>Rodrigo Guerrero</w:t>
       </w:r>
       <w:r>
         <w:rPr>
@@ -121,7 +109,27 @@
           <w:sz w:val="28"/>
           <w:szCs w:val="28"/>
         </w:rPr>
-        <w:t>Nombre 3</w:t>
+        <w:t xml:space="preserve"> </w:t>
+      </w:r>
+      <w:r>
+        <w:br/>
+      </w:r>
+      <w:r>
+        <w:tab/>
+      </w:r>
+      <w:r>
+        <w:tab/>
+      </w:r>
+      <w:r>
+        <w:t xml:space="preserve"> </w:t>
+      </w:r>
+      <w:r>
+        <w:rPr>
+          <w:color w:val="156082" w:themeColor="accent1"/>
+          <w:sz w:val="28"/>
+          <w:szCs w:val="28"/>
+        </w:rPr>
+        <w:t>Ángel Salgado</w:t>
       </w:r>
       <w:r>
         <w:br/>
@@ -241,7 +249,7 @@
           <w:bCs/>
         </w:rPr>
       </w:pPr>
-      <w:bookmarkStart w:id="0" w:name="_Toc239453089"/>
+      <w:bookmarkStart w:id="0" w:name="_Toc239632504"/>
       <w:r>
         <w:rPr>
           <w:b/>
@@ -307,7 +315,7 @@
           <w:r>
             <w:fldChar w:fldCharType="separate"/>
           </w:r>
-          <w:hyperlink w:anchor="_Toc239453089" w:history="1">
+          <w:hyperlink w:anchor="_Toc239632504" w:history="1">
             <w:r>
               <w:rPr>
                 <w:rStyle w:val="Hipervnculo"/>
@@ -336,7 +344,7 @@
                 <w:noProof/>
                 <w:webHidden/>
               </w:rPr>
-              <w:instrText xml:space="preserve"> PAGEREF _Toc239453089 \h </w:instrText>
+              <w:instrText xml:space="preserve"> PAGEREF _Toc239632504 \h </w:instrText>
             </w:r>
             <w:r>
               <w:rPr>
@@ -383,7 +391,7 @@
               <w14:ligatures w14:val="standardContextual"/>
             </w:rPr>
           </w:pPr>
-          <w:hyperlink w:anchor="_Toc239453090" w:history="1">
+          <w:hyperlink w:anchor="_Toc239632505" w:history="1">
             <w:r>
               <w:rPr>
                 <w:rStyle w:val="Hipervnculo"/>
@@ -435,7 +443,7 @@
                 <w:noProof/>
                 <w:webHidden/>
               </w:rPr>
-              <w:instrText xml:space="preserve"> PAGEREF _Toc239453090 \h </w:instrText>
+              <w:instrText xml:space="preserve"> PAGEREF _Toc239632505 \h </w:instrText>
             </w:r>
             <w:r>
               <w:rPr>
@@ -482,7 +490,7 @@
               <w14:ligatures w14:val="standardContextual"/>
             </w:rPr>
           </w:pPr>
-          <w:hyperlink w:anchor="_Toc239453091" w:history="1">
+          <w:hyperlink w:anchor="_Toc239632506" w:history="1">
             <w:r>
               <w:rPr>
                 <w:rStyle w:val="Hipervnculo"/>
@@ -534,7 +542,7 @@
                 <w:noProof/>
                 <w:webHidden/>
               </w:rPr>
-              <w:instrText xml:space="preserve"> PAGEREF _Toc239453091 \h </w:instrText>
+              <w:instrText xml:space="preserve"> PAGEREF _Toc239632506 \h </w:instrText>
             </w:r>
             <w:r>
               <w:rPr>
@@ -581,7 +589,7 @@
               <w14:ligatures w14:val="standardContextual"/>
             </w:rPr>
           </w:pPr>
-          <w:hyperlink w:anchor="_Toc239453092" w:history="1">
+          <w:hyperlink w:anchor="_Toc239632507" w:history="1">
             <w:r>
               <w:rPr>
                 <w:rStyle w:val="Hipervnculo"/>
@@ -633,7 +641,7 @@
                 <w:noProof/>
                 <w:webHidden/>
               </w:rPr>
-              <w:instrText xml:space="preserve"> PAGEREF _Toc239453092 \h </w:instrText>
+              <w:instrText xml:space="preserve"> PAGEREF _Toc239632507 \h </w:instrText>
             </w:r>
             <w:r>
               <w:rPr>
@@ -681,7 +689,7 @@
               <w14:ligatures w14:val="standardContextual"/>
             </w:rPr>
           </w:pPr>
-          <w:hyperlink w:anchor="_Toc239453093" w:history="1">
+          <w:hyperlink w:anchor="_Toc239632508" w:history="1">
             <w:r>
               <w:rPr>
                 <w:rStyle w:val="Hipervnculo"/>
@@ -731,7 +739,7 @@
                 <w:noProof/>
                 <w:webHidden/>
               </w:rPr>
-              <w:instrText xml:space="preserve"> PAGEREF _Toc239453093 \h </w:instrText>
+              <w:instrText xml:space="preserve"> PAGEREF _Toc239632508 \h </w:instrText>
             </w:r>
             <w:r>
               <w:rPr>
@@ -778,7 +786,7 @@
               <w14:ligatures w14:val="standardContextual"/>
             </w:rPr>
           </w:pPr>
-          <w:hyperlink w:anchor="_Toc239453094" w:history="1">
+          <w:hyperlink w:anchor="_Toc239632509" w:history="1">
             <w:r>
               <w:rPr>
                 <w:rStyle w:val="Hipervnculo"/>
@@ -827,7 +835,7 @@
                 <w:noProof/>
                 <w:webHidden/>
               </w:rPr>
-              <w:instrText xml:space="preserve"> PAGEREF _Toc239453094 \h </w:instrText>
+              <w:instrText xml:space="preserve"> PAGEREF _Toc239632509 \h </w:instrText>
             </w:r>
             <w:r>
               <w:rPr>
@@ -874,7 +882,7 @@
               <w14:ligatures w14:val="standardContextual"/>
             </w:rPr>
           </w:pPr>
-          <w:hyperlink w:anchor="_Toc239453095" w:history="1">
+          <w:hyperlink w:anchor="_Toc239632510" w:history="1">
             <w:r>
               <w:rPr>
                 <w:rStyle w:val="Hipervnculo"/>
@@ -923,7 +931,7 @@
                 <w:noProof/>
                 <w:webHidden/>
               </w:rPr>
-              <w:instrText xml:space="preserve"> PAGEREF _Toc239453095 \h </w:instrText>
+              <w:instrText xml:space="preserve"> PAGEREF _Toc239632510 \h </w:instrText>
             </w:r>
             <w:r>
               <w:rPr>
@@ -971,7 +979,7 @@
               <w14:ligatures w14:val="standardContextual"/>
             </w:rPr>
           </w:pPr>
-          <w:hyperlink w:anchor="_Toc239453096" w:history="1">
+          <w:hyperlink w:anchor="_Toc239632511" w:history="1">
             <w:r>
               <w:rPr>
                 <w:rStyle w:val="Hipervnculo"/>
@@ -1021,7 +1029,7 @@
                 <w:noProof/>
                 <w:webHidden/>
               </w:rPr>
-              <w:instrText xml:space="preserve"> PAGEREF _Toc239453096 \h </w:instrText>
+              <w:instrText xml:space="preserve"> PAGEREF _Toc239632511 \h </w:instrText>
             </w:r>
             <w:r>
               <w:rPr>
@@ -1069,7 +1077,7 @@
               <w14:ligatures w14:val="standardContextual"/>
             </w:rPr>
           </w:pPr>
-          <w:hyperlink w:anchor="_Toc239453097" w:history="1">
+          <w:hyperlink w:anchor="_Toc239632512" w:history="1">
             <w:r>
               <w:rPr>
                 <w:rStyle w:val="Hipervnculo"/>
@@ -1119,7 +1127,7 @@
                 <w:noProof/>
                 <w:webHidden/>
               </w:rPr>
-              <w:instrText xml:space="preserve"> PAGEREF _Toc239453097 \h </w:instrText>
+              <w:instrText xml:space="preserve"> PAGEREF _Toc239632512 \h </w:instrText>
             </w:r>
             <w:r>
               <w:rPr>
@@ -1167,7 +1175,7 @@
               <w14:ligatures w14:val="standardContextual"/>
             </w:rPr>
           </w:pPr>
-          <w:hyperlink w:anchor="_Toc239453098" w:history="1">
+          <w:hyperlink w:anchor="_Toc239632513" w:history="1">
             <w:r>
               <w:rPr>
                 <w:rStyle w:val="Hipervnculo"/>
@@ -1217,7 +1225,7 @@
                 <w:noProof/>
                 <w:webHidden/>
               </w:rPr>
-              <w:instrText xml:space="preserve"> PAGEREF _Toc239453098 \h </w:instrText>
+              <w:instrText xml:space="preserve"> PAGEREF _Toc239632513 \h </w:instrText>
             </w:r>
             <w:r>
               <w:rPr>
@@ -1265,7 +1273,7 @@
               <w14:ligatures w14:val="standardContextual"/>
             </w:rPr>
           </w:pPr>
-          <w:hyperlink w:anchor="_Toc239453099" w:history="1">
+          <w:hyperlink w:anchor="_Toc239632514" w:history="1">
             <w:r>
               <w:rPr>
                 <w:rStyle w:val="Hipervnculo"/>
@@ -1315,7 +1323,7 @@
                 <w:noProof/>
                 <w:webHidden/>
               </w:rPr>
-              <w:instrText xml:space="preserve"> PAGEREF _Toc239453099 \h </w:instrText>
+              <w:instrText xml:space="preserve"> PAGEREF _Toc239632514 \h </w:instrText>
             </w:r>
             <w:r>
               <w:rPr>
@@ -1363,7 +1371,7 @@
               <w14:ligatures w14:val="standardContextual"/>
             </w:rPr>
           </w:pPr>
-          <w:hyperlink w:anchor="_Toc239453100" w:history="1">
+          <w:hyperlink w:anchor="_Toc239632515" w:history="1">
             <w:r>
               <w:rPr>
                 <w:rStyle w:val="Hipervnculo"/>
@@ -1413,7 +1421,7 @@
                 <w:noProof/>
                 <w:webHidden/>
               </w:rPr>
-              <w:instrText xml:space="preserve"> PAGEREF _Toc239453100 \h </w:instrText>
+              <w:instrText xml:space="preserve"> PAGEREF _Toc239632515 \h </w:instrText>
             </w:r>
             <w:r>
               <w:rPr>
@@ -1461,7 +1469,7 @@
               <w14:ligatures w14:val="standardContextual"/>
             </w:rPr>
           </w:pPr>
-          <w:hyperlink w:anchor="_Toc239453101" w:history="1">
+          <w:hyperlink w:anchor="_Toc239632516" w:history="1">
             <w:r>
               <w:rPr>
                 <w:rStyle w:val="Hipervnculo"/>
@@ -1511,7 +1519,7 @@
                 <w:noProof/>
                 <w:webHidden/>
               </w:rPr>
-              <w:instrText xml:space="preserve"> PAGEREF _Toc239453101 \h </w:instrText>
+              <w:instrText xml:space="preserve"> PAGEREF _Toc239632516 \h </w:instrText>
             </w:r>
             <w:r>
               <w:rPr>
@@ -1532,6 +1540,105 @@
                 <w:webHidden/>
               </w:rPr>
               <w:t>8</w:t>
+            </w:r>
+            <w:r>
+              <w:rPr>
+                <w:noProof/>
+                <w:webHidden/>
+              </w:rPr>
+              <w:fldChar w:fldCharType="end"/>
+            </w:r>
+          </w:hyperlink>
+        </w:p>
+        <w:p>
+          <w:pPr>
+            <w:pStyle w:val="TDC1"/>
+            <w:tabs>
+              <w:tab w:val="left" w:pos="440"/>
+              <w:tab w:val="right" w:leader="dot" w:pos="8828"/>
+            </w:tabs>
+            <w:rPr>
+              <w:rFonts w:cstheme="minorBidi"/>
+              <w:noProof/>
+              <w:kern w:val="2"/>
+              <w:sz w:val="24"/>
+              <w:szCs w:val="24"/>
+              <w14:ligatures w14:val="standardContextual"/>
+            </w:rPr>
+          </w:pPr>
+          <w:hyperlink w:anchor="_Toc239632517" w:history="1">
+            <w:r>
+              <w:rPr>
+                <w:rStyle w:val="Hipervnculo"/>
+                <w:rFonts w:ascii="Calibri" w:hAnsi="Calibri" w:cs="Calibri"/>
+                <w:b/>
+                <w:bCs/>
+                <w:iCs/>
+                <w:noProof/>
+              </w:rPr>
+              <w:t>4.</w:t>
+            </w:r>
+            <w:r>
+              <w:rPr>
+                <w:rFonts w:cstheme="minorBidi"/>
+                <w:noProof/>
+                <w:kern w:val="2"/>
+                <w:sz w:val="24"/>
+                <w:szCs w:val="24"/>
+                <w14:ligatures w14:val="standardContextual"/>
+              </w:rPr>
+              <w:tab/>
+            </w:r>
+            <w:r>
+              <w:rPr>
+                <w:rStyle w:val="Hipervnculo"/>
+                <w:rFonts w:ascii="Calibri" w:hAnsi="Calibri" w:cs="Calibri"/>
+                <w:b/>
+                <w:bCs/>
+                <w:noProof/>
+              </w:rPr>
+              <w:t>Técnicas de prompting utilizadas</w:t>
+            </w:r>
+            <w:r>
+              <w:rPr>
+                <w:noProof/>
+                <w:webHidden/>
+              </w:rPr>
+              <w:tab/>
+            </w:r>
+            <w:r>
+              <w:rPr>
+                <w:noProof/>
+                <w:webHidden/>
+              </w:rPr>
+              <w:fldChar w:fldCharType="begin"/>
+            </w:r>
+            <w:r>
+              <w:rPr>
+                <w:noProof/>
+                <w:webHidden/>
+              </w:rPr>
+              <w:instrText xml:space="preserve"> PAGEREF _Toc239632517 \h </w:instrText>
+            </w:r>
+            <w:r>
+              <w:rPr>
+                <w:noProof/>
+                <w:webHidden/>
+              </w:rPr>
+            </w:r>
+            <w:r>
+              <w:rPr>
+                <w:noProof/>
+                <w:webHidden/>
+              </w:rPr>
+              <w:fldChar w:fldCharType="separate"/>
+            </w:r>
+            <w:r>
+              <w:rPr>
+                <w:noProof/>
+                <w:webHidden/>
+              </w:rPr>
+              <w:t>9</w:t>
             </w:r>
             <w:r>
               <w:rPr>
@@ -1558,13 +1665,15 @@
               <w14:ligatures w14:val="standardContextual"/>
             </w:rPr>
           </w:pPr>
-          <w:hyperlink w:anchor="_Toc239453102" w:history="1">
+          <w:hyperlink w:anchor="_Toc239632518" w:history="1">
             <w:r>
               <w:rPr>
                 <w:rStyle w:val="Hipervnculo"/>
-                <w:noProof/>
-              </w:rPr>
-              <w:t>Pegar imagen</w:t>
+                <w:b/>
+                <w:bCs/>
+                <w:noProof/>
+              </w:rPr>
+              <w:t>4.1 Grounded Prompting</w:t>
             </w:r>
             <w:r>
               <w:rPr>
@@ -1585,7 +1694,7 @@
                 <w:noProof/>
                 <w:webHidden/>
               </w:rPr>
-              <w:instrText xml:space="preserve"> PAGEREF _Toc239453102 \h </w:instrText>
+              <w:instrText xml:space="preserve"> PAGEREF _Toc239632518 \h </w:instrText>
             </w:r>
             <w:r>
               <w:rPr>
@@ -1605,7 +1714,311 @@
                 <w:noProof/>
                 <w:webHidden/>
               </w:rPr>
-              <w:t>8</w:t>
+              <w:t>9</w:t>
+            </w:r>
+            <w:r>
+              <w:rPr>
+                <w:noProof/>
+                <w:webHidden/>
+              </w:rPr>
+              <w:fldChar w:fldCharType="end"/>
+            </w:r>
+          </w:hyperlink>
+        </w:p>
+        <w:p>
+          <w:pPr>
+            <w:pStyle w:val="TDC2"/>
+            <w:tabs>
+              <w:tab w:val="right" w:leader="dot" w:pos="8828"/>
+            </w:tabs>
+            <w:rPr>
+              <w:rFonts w:asciiTheme="minorHAnsi" w:eastAsiaTheme="minorEastAsia" w:hAnsiTheme="minorHAnsi" w:cstheme="minorBidi"/>
+              <w:noProof/>
+              <w:kern w:val="2"/>
+              <w:sz w:val="24"/>
+              <w:szCs w:val="24"/>
+              <w:lang w:eastAsia="ja-JP"/>
+              <w14:ligatures w14:val="standardContextual"/>
+            </w:rPr>
+          </w:pPr>
+          <w:hyperlink w:anchor="_Toc239632519" w:history="1">
+            <w:r>
+              <w:rPr>
+                <w:rStyle w:val="Hipervnculo"/>
+                <w:b/>
+                <w:bCs/>
+                <w:noProof/>
+              </w:rPr>
+              <w:t>4.2 Structured Output Prompting</w:t>
+            </w:r>
+            <w:r>
+              <w:rPr>
+                <w:noProof/>
+                <w:webHidden/>
+              </w:rPr>
+              <w:tab/>
+            </w:r>
+            <w:r>
+              <w:rPr>
+                <w:noProof/>
+                <w:webHidden/>
+              </w:rPr>
+              <w:fldChar w:fldCharType="begin"/>
+            </w:r>
+            <w:r>
+              <w:rPr>
+                <w:noProof/>
+                <w:webHidden/>
+              </w:rPr>
+              <w:instrText xml:space="preserve"> PAGEREF _Toc239632519 \h </w:instrText>
+            </w:r>
+            <w:r>
+              <w:rPr>
+                <w:noProof/>
+                <w:webHidden/>
+              </w:rPr>
+            </w:r>
+            <w:r>
+              <w:rPr>
+                <w:noProof/>
+                <w:webHidden/>
+              </w:rPr>
+              <w:fldChar w:fldCharType="separate"/>
+            </w:r>
+            <w:r>
+              <w:rPr>
+                <w:noProof/>
+                <w:webHidden/>
+              </w:rPr>
+              <w:t>9</w:t>
+            </w:r>
+            <w:r>
+              <w:rPr>
+                <w:noProof/>
+                <w:webHidden/>
+              </w:rPr>
+              <w:fldChar w:fldCharType="end"/>
+            </w:r>
+          </w:hyperlink>
+        </w:p>
+        <w:p>
+          <w:pPr>
+            <w:pStyle w:val="TDC2"/>
+            <w:tabs>
+              <w:tab w:val="right" w:leader="dot" w:pos="8828"/>
+            </w:tabs>
+            <w:rPr>
+              <w:rFonts w:asciiTheme="minorHAnsi" w:eastAsiaTheme="minorEastAsia" w:hAnsiTheme="minorHAnsi" w:cstheme="minorBidi"/>
+              <w:noProof/>
+              <w:kern w:val="2"/>
+              <w:sz w:val="24"/>
+              <w:szCs w:val="24"/>
+              <w:lang w:eastAsia="ja-JP"/>
+              <w14:ligatures w14:val="standardContextual"/>
+            </w:rPr>
+          </w:pPr>
+          <w:hyperlink w:anchor="_Toc239632520" w:history="1">
+            <w:r>
+              <w:rPr>
+                <w:rStyle w:val="Hipervnculo"/>
+                <w:b/>
+                <w:bCs/>
+                <w:noProof/>
+              </w:rPr>
+              <w:t>4.3 LLM-as-a-Judge</w:t>
+            </w:r>
+            <w:r>
+              <w:rPr>
+                <w:noProof/>
+                <w:webHidden/>
+              </w:rPr>
+              <w:tab/>
+            </w:r>
+            <w:r>
+              <w:rPr>
+                <w:noProof/>
+                <w:webHidden/>
+              </w:rPr>
+              <w:fldChar w:fldCharType="begin"/>
+            </w:r>
+            <w:r>
+              <w:rPr>
+                <w:noProof/>
+                <w:webHidden/>
+              </w:rPr>
+              <w:instrText xml:space="preserve"> PAGEREF _Toc239632520 \h </w:instrText>
+            </w:r>
+            <w:r>
+              <w:rPr>
+                <w:noProof/>
+                <w:webHidden/>
+              </w:rPr>
+            </w:r>
+            <w:r>
+              <w:rPr>
+                <w:noProof/>
+                <w:webHidden/>
+              </w:rPr>
+              <w:fldChar w:fldCharType="separate"/>
+            </w:r>
+            <w:r>
+              <w:rPr>
+                <w:noProof/>
+                <w:webHidden/>
+              </w:rPr>
+              <w:t>9</w:t>
+            </w:r>
+            <w:r>
+              <w:rPr>
+                <w:noProof/>
+                <w:webHidden/>
+              </w:rPr>
+              <w:fldChar w:fldCharType="end"/>
+            </w:r>
+          </w:hyperlink>
+        </w:p>
+        <w:p>
+          <w:pPr>
+            <w:pStyle w:val="TDC2"/>
+            <w:tabs>
+              <w:tab w:val="right" w:leader="dot" w:pos="8828"/>
+            </w:tabs>
+            <w:rPr>
+              <w:rFonts w:asciiTheme="minorHAnsi" w:eastAsiaTheme="minorEastAsia" w:hAnsiTheme="minorHAnsi" w:cstheme="minorBidi"/>
+              <w:noProof/>
+              <w:kern w:val="2"/>
+              <w:sz w:val="24"/>
+              <w:szCs w:val="24"/>
+              <w:lang w:eastAsia="ja-JP"/>
+              <w14:ligatures w14:val="standardContextual"/>
+            </w:rPr>
+          </w:pPr>
+          <w:hyperlink w:anchor="_Toc239632521" w:history="1">
+            <w:r>
+              <w:rPr>
+                <w:rStyle w:val="Hipervnculo"/>
+                <w:b/>
+                <w:bCs/>
+                <w:noProof/>
+              </w:rPr>
+              <w:t>4.4 Plan-and-Solve Prompting + Grounded Prompting</w:t>
+            </w:r>
+            <w:r>
+              <w:rPr>
+                <w:noProof/>
+                <w:webHidden/>
+              </w:rPr>
+              <w:tab/>
+            </w:r>
+            <w:r>
+              <w:rPr>
+                <w:noProof/>
+                <w:webHidden/>
+              </w:rPr>
+              <w:fldChar w:fldCharType="begin"/>
+            </w:r>
+            <w:r>
+              <w:rPr>
+                <w:noProof/>
+                <w:webHidden/>
+              </w:rPr>
+              <w:instrText xml:space="preserve"> PAGEREF _Toc239632521 \h </w:instrText>
+            </w:r>
+            <w:r>
+              <w:rPr>
+                <w:noProof/>
+                <w:webHidden/>
+              </w:rPr>
+            </w:r>
+            <w:r>
+              <w:rPr>
+                <w:noProof/>
+                <w:webHidden/>
+              </w:rPr>
+              <w:fldChar w:fldCharType="separate"/>
+            </w:r>
+            <w:r>
+              <w:rPr>
+                <w:noProof/>
+                <w:webHidden/>
+              </w:rPr>
+              <w:t>10</w:t>
+            </w:r>
+            <w:r>
+              <w:rPr>
+                <w:noProof/>
+                <w:webHidden/>
+              </w:rPr>
+              <w:fldChar w:fldCharType="end"/>
+            </w:r>
+          </w:hyperlink>
+        </w:p>
+        <w:p>
+          <w:pPr>
+            <w:pStyle w:val="TDC2"/>
+            <w:tabs>
+              <w:tab w:val="right" w:leader="dot" w:pos="8828"/>
+            </w:tabs>
+            <w:rPr>
+              <w:rFonts w:asciiTheme="minorHAnsi" w:eastAsiaTheme="minorEastAsia" w:hAnsiTheme="minorHAnsi" w:cstheme="minorBidi"/>
+              <w:noProof/>
+              <w:kern w:val="2"/>
+              <w:sz w:val="24"/>
+              <w:szCs w:val="24"/>
+              <w:lang w:eastAsia="ja-JP"/>
+              <w14:ligatures w14:val="standardContextual"/>
+            </w:rPr>
+          </w:pPr>
+          <w:hyperlink w:anchor="_Toc239632522" w:history="1">
+            <w:r>
+              <w:rPr>
+                <w:rStyle w:val="Hipervnculo"/>
+                <w:b/>
+                <w:bCs/>
+                <w:noProof/>
+              </w:rPr>
+              <w:t>4.5 Plan-and-Solve Prompting</w:t>
+            </w:r>
+            <w:r>
+              <w:rPr>
+                <w:noProof/>
+                <w:webHidden/>
+              </w:rPr>
+              <w:tab/>
+            </w:r>
+            <w:r>
+              <w:rPr>
+                <w:noProof/>
+                <w:webHidden/>
+              </w:rPr>
+              <w:fldChar w:fldCharType="begin"/>
+            </w:r>
+            <w:r>
+              <w:rPr>
+                <w:noProof/>
+                <w:webHidden/>
+              </w:rPr>
+              <w:instrText xml:space="preserve"> PAGEREF _Toc239632522 \h </w:instrText>
+            </w:r>
+            <w:r>
+              <w:rPr>
+                <w:noProof/>
+                <w:webHidden/>
+              </w:rPr>
+            </w:r>
+            <w:r>
+              <w:rPr>
+                <w:noProof/>
+                <w:webHidden/>
+              </w:rPr>
+              <w:fldChar w:fldCharType="separate"/>
+            </w:r>
+            <w:r>
+              <w:rPr>
+                <w:noProof/>
+                <w:webHidden/>
+              </w:rPr>
+              <w:t>10</w:t>
             </w:r>
             <w:r>
               <w:rPr>
@@ -1632,7 +2045,7 @@
               <w14:ligatures w14:val="standardContextual"/>
             </w:rPr>
           </w:pPr>
-          <w:hyperlink w:anchor="_Toc239453103" w:history="1">
+          <w:hyperlink w:anchor="_Toc239632523" w:history="1">
             <w:r>
               <w:rPr>
                 <w:rStyle w:val="Hipervnculo"/>
@@ -1642,7 +2055,7 @@
                 <w:iCs/>
                 <w:noProof/>
               </w:rPr>
-              <w:t>4.</w:t>
+              <w:t>5.</w:t>
             </w:r>
             <w:r>
               <w:rPr>
@@ -1663,7 +2076,7 @@
                 <w:bCs/>
                 <w:noProof/>
               </w:rPr>
-              <w:t>Técnicas de prompting utilizadas</w:t>
+              <w:t>Inconsistencias detectadas y su resolución</w:t>
             </w:r>
             <w:r>
               <w:rPr>
@@ -1684,7 +2097,7 @@
                 <w:noProof/>
                 <w:webHidden/>
               </w:rPr>
-              <w:instrText xml:space="preserve"> PAGEREF _Toc239453103 \h </w:instrText>
+              <w:instrText xml:space="preserve"> PAGEREF _Toc239632523 \h </w:instrText>
             </w:r>
             <w:r>
               <w:rPr>
@@ -1704,7 +2117,83 @@
                 <w:noProof/>
                 <w:webHidden/>
               </w:rPr>
-              <w:t>9</w:t>
+              <w:t>11</w:t>
+            </w:r>
+            <w:r>
+              <w:rPr>
+                <w:noProof/>
+                <w:webHidden/>
+              </w:rPr>
+              <w:fldChar w:fldCharType="end"/>
+            </w:r>
+          </w:hyperlink>
+        </w:p>
+        <w:p>
+          <w:pPr>
+            <w:pStyle w:val="TDC2"/>
+            <w:tabs>
+              <w:tab w:val="right" w:leader="dot" w:pos="8828"/>
+            </w:tabs>
+            <w:rPr>
+              <w:rFonts w:asciiTheme="minorHAnsi" w:eastAsiaTheme="minorEastAsia" w:hAnsiTheme="minorHAnsi" w:cstheme="minorBidi"/>
+              <w:noProof/>
+              <w:kern w:val="2"/>
+              <w:sz w:val="24"/>
+              <w:szCs w:val="24"/>
+              <w:lang w:eastAsia="ja-JP"/>
+              <w14:ligatures w14:val="standardContextual"/>
+            </w:rPr>
+          </w:pPr>
+          <w:hyperlink w:anchor="_Toc239632524" w:history="1">
+            <w:r>
+              <w:rPr>
+                <w:rStyle w:val="Hipervnculo"/>
+                <w:b/>
+                <w:bCs/>
+                <w:noProof/>
+              </w:rPr>
+              <w:t>5.1 Inconsistencias resueltas</w:t>
+            </w:r>
+            <w:r>
+              <w:rPr>
+                <w:noProof/>
+                <w:webHidden/>
+              </w:rPr>
+              <w:tab/>
+            </w:r>
+            <w:r>
+              <w:rPr>
+                <w:noProof/>
+                <w:webHidden/>
+              </w:rPr>
+              <w:fldChar w:fldCharType="begin"/>
+            </w:r>
+            <w:r>
+              <w:rPr>
+                <w:noProof/>
+                <w:webHidden/>
+              </w:rPr>
+              <w:instrText xml:space="preserve"> PAGEREF _Toc239632524 \h </w:instrText>
+            </w:r>
+            <w:r>
+              <w:rPr>
+                <w:noProof/>
+                <w:webHidden/>
+              </w:rPr>
+            </w:r>
+            <w:r>
+              <w:rPr>
+                <w:noProof/>
+                <w:webHidden/>
+              </w:rPr>
+              <w:fldChar w:fldCharType="separate"/>
+            </w:r>
+            <w:r>
+              <w:rPr>
+                <w:noProof/>
+                <w:webHidden/>
+              </w:rPr>
+              <w:t>11</w:t>
             </w:r>
             <w:r>
               <w:rPr>
@@ -1731,7 +2220,7 @@
               <w14:ligatures w14:val="standardContextual"/>
             </w:rPr>
           </w:pPr>
-          <w:hyperlink w:anchor="_Toc239453104" w:history="1">
+          <w:hyperlink w:anchor="_Toc239632525" w:history="1">
             <w:r>
               <w:rPr>
                 <w:rStyle w:val="Hipervnculo"/>
@@ -1741,7 +2230,7 @@
                 <w:iCs/>
                 <w:noProof/>
               </w:rPr>
-              <w:t>5.</w:t>
+              <w:t>6.</w:t>
             </w:r>
             <w:r>
               <w:rPr>
@@ -1762,7 +2251,7 @@
                 <w:bCs/>
                 <w:noProof/>
               </w:rPr>
-              <w:t>Inconsistencias detectadas y su resolución</w:t>
+              <w:t>Discusión</w:t>
             </w:r>
             <w:r>
               <w:rPr>
@@ -1783,7 +2272,7 @@
                 <w:noProof/>
                 <w:webHidden/>
               </w:rPr>
-              <w:instrText xml:space="preserve"> PAGEREF _Toc239453104 \h </w:instrText>
+              <w:instrText xml:space="preserve"> PAGEREF _Toc239632525 \h </w:instrText>
             </w:r>
             <w:r>
               <w:rPr>
@@ -1803,159 +2292,7 @@
                 <w:noProof/>
                 <w:webHidden/>
               </w:rPr>
-              <w:t>10</w:t>
-            </w:r>
-            <w:r>
-              <w:rPr>
-                <w:noProof/>
-                <w:webHidden/>
-              </w:rPr>
-              <w:fldChar w:fldCharType="end"/>
-            </w:r>
-          </w:hyperlink>
-        </w:p>
-        <w:p>
-          <w:pPr>
-            <w:pStyle w:val="TDC2"/>
-            <w:tabs>
-              <w:tab w:val="right" w:leader="dot" w:pos="8828"/>
-            </w:tabs>
-            <w:rPr>
-              <w:rFonts w:asciiTheme="minorHAnsi" w:eastAsiaTheme="minorEastAsia" w:hAnsiTheme="minorHAnsi" w:cstheme="minorBidi"/>
-              <w:noProof/>
-              <w:kern w:val="2"/>
-              <w:sz w:val="24"/>
-              <w:szCs w:val="24"/>
-              <w:lang w:eastAsia="ja-JP"/>
-              <w14:ligatures w14:val="standardContextual"/>
-            </w:rPr>
-          </w:pPr>
-          <w:hyperlink w:anchor="_Toc239453105" w:history="1">
-            <w:r>
-              <w:rPr>
-                <w:rStyle w:val="Hipervnculo"/>
-                <w:b/>
-                <w:bCs/>
-                <w:noProof/>
-              </w:rPr>
-              <w:t>5.1 Inconsistencias resueltas</w:t>
-            </w:r>
-            <w:r>
-              <w:rPr>
-                <w:noProof/>
-                <w:webHidden/>
-              </w:rPr>
-              <w:tab/>
-            </w:r>
-            <w:r>
-              <w:rPr>
-                <w:noProof/>
-                <w:webHidden/>
-              </w:rPr>
-              <w:fldChar w:fldCharType="begin"/>
-            </w:r>
-            <w:r>
-              <w:rPr>
-                <w:noProof/>
-                <w:webHidden/>
-              </w:rPr>
-              <w:instrText xml:space="preserve"> PAGEREF _Toc239453105 \h </w:instrText>
-            </w:r>
-            <w:r>
-              <w:rPr>
-                <w:noProof/>
-                <w:webHidden/>
-              </w:rPr>
-            </w:r>
-            <w:r>
-              <w:rPr>
-                <w:noProof/>
-                <w:webHidden/>
-              </w:rPr>
-              <w:fldChar w:fldCharType="separate"/>
-            </w:r>
-            <w:r>
-              <w:rPr>
-                <w:noProof/>
-                <w:webHidden/>
-              </w:rPr>
-              <w:t>10</w:t>
-            </w:r>
-            <w:r>
-              <w:rPr>
-                <w:noProof/>
-                <w:webHidden/>
-              </w:rPr>
-              <w:fldChar w:fldCharType="end"/>
-            </w:r>
-          </w:hyperlink>
-        </w:p>
-        <w:p>
-          <w:pPr>
-            <w:pStyle w:val="TDC2"/>
-            <w:tabs>
-              <w:tab w:val="right" w:leader="dot" w:pos="8828"/>
-            </w:tabs>
-            <w:rPr>
-              <w:rFonts w:asciiTheme="minorHAnsi" w:eastAsiaTheme="minorEastAsia" w:hAnsiTheme="minorHAnsi" w:cstheme="minorBidi"/>
-              <w:noProof/>
-              <w:kern w:val="2"/>
-              <w:sz w:val="24"/>
-              <w:szCs w:val="24"/>
-              <w:lang w:eastAsia="ja-JP"/>
-              <w14:ligatures w14:val="standardContextual"/>
-            </w:rPr>
-          </w:pPr>
-          <w:hyperlink w:anchor="_Toc239453106" w:history="1">
-            <w:r>
-              <w:rPr>
-                <w:rStyle w:val="Hipervnculo"/>
-                <w:b/>
-                <w:bCs/>
-                <w:noProof/>
-              </w:rPr>
-              <w:t>5.2 Decisiones realizadas</w:t>
-            </w:r>
-            <w:r>
-              <w:rPr>
-                <w:noProof/>
-                <w:webHidden/>
-              </w:rPr>
-              <w:tab/>
-            </w:r>
-            <w:r>
-              <w:rPr>
-                <w:noProof/>
-                <w:webHidden/>
-              </w:rPr>
-              <w:fldChar w:fldCharType="begin"/>
-            </w:r>
-            <w:r>
-              <w:rPr>
-                <w:noProof/>
-                <w:webHidden/>
-              </w:rPr>
-              <w:instrText xml:space="preserve"> PAGEREF _Toc239453106 \h </w:instrText>
-            </w:r>
-            <w:r>
-              <w:rPr>
-                <w:noProof/>
-                <w:webHidden/>
-              </w:rPr>
-            </w:r>
-            <w:r>
-              <w:rPr>
-                <w:noProof/>
-                <w:webHidden/>
-              </w:rPr>
-              <w:fldChar w:fldCharType="separate"/>
-            </w:r>
-            <w:r>
-              <w:rPr>
-                <w:noProof/>
-                <w:webHidden/>
-              </w:rPr>
-              <w:t>10</w:t>
+              <w:t>13</w:t>
             </w:r>
             <w:r>
               <w:rPr>
@@ -1982,7 +2319,7 @@
               <w14:ligatures w14:val="standardContextual"/>
             </w:rPr>
           </w:pPr>
-          <w:hyperlink w:anchor="_Toc239453107" w:history="1">
+          <w:hyperlink w:anchor="_Toc239632526" w:history="1">
             <w:r>
               <w:rPr>
                 <w:rStyle w:val="Hipervnculo"/>
@@ -1992,7 +2329,7 @@
                 <w:iCs/>
                 <w:noProof/>
               </w:rPr>
-              <w:t>6.</w:t>
+              <w:t>7.</w:t>
             </w:r>
             <w:r>
               <w:rPr>
@@ -2013,7 +2350,7 @@
                 <w:bCs/>
                 <w:noProof/>
               </w:rPr>
-              <w:t>Discusión</w:t>
+              <w:t>Conclusiones</w:t>
             </w:r>
             <w:r>
               <w:rPr>
@@ -2034,7 +2371,7 @@
                 <w:noProof/>
                 <w:webHidden/>
               </w:rPr>
-              <w:instrText xml:space="preserve"> PAGEREF _Toc239453107 \h </w:instrText>
+              <w:instrText xml:space="preserve"> PAGEREF _Toc239632526 \h </w:instrText>
             </w:r>
             <w:r>
               <w:rPr>
@@ -2054,7 +2391,7 @@
                 <w:noProof/>
                 <w:webHidden/>
               </w:rPr>
-              <w:t>11</w:t>
+              <w:t>14</w:t>
             </w:r>
             <w:r>
               <w:rPr>
@@ -2081,7 +2418,7 @@
               <w14:ligatures w14:val="standardContextual"/>
             </w:rPr>
           </w:pPr>
-          <w:hyperlink w:anchor="_Toc239453108" w:history="1">
+          <w:hyperlink w:anchor="_Toc239632527" w:history="1">
             <w:r>
               <w:rPr>
                 <w:rStyle w:val="Hipervnculo"/>
@@ -2091,7 +2428,7 @@
                 <w:iCs/>
                 <w:noProof/>
               </w:rPr>
-              <w:t>7.</w:t>
+              <w:t>8.</w:t>
             </w:r>
             <w:r>
               <w:rPr>
@@ -2112,7 +2449,7 @@
                 <w:bCs/>
                 <w:noProof/>
               </w:rPr>
-              <w:t>Conclusiones</w:t>
+              <w:t>Anexos</w:t>
             </w:r>
             <w:r>
               <w:rPr>
@@ -2133,7 +2470,7 @@
                 <w:noProof/>
                 <w:webHidden/>
               </w:rPr>
-              <w:instrText xml:space="preserve"> PAGEREF _Toc239453108 \h </w:instrText>
+              <w:instrText xml:space="preserve"> PAGEREF _Toc239632527 \h </w:instrText>
             </w:r>
             <w:r>
               <w:rPr>
@@ -2153,106 +2490,7 @@
                 <w:noProof/>
                 <w:webHidden/>
               </w:rPr>
-              <w:t>12</w:t>
-            </w:r>
-            <w:r>
-              <w:rPr>
-                <w:noProof/>
-                <w:webHidden/>
-              </w:rPr>
-              <w:fldChar w:fldCharType="end"/>
-            </w:r>
-          </w:hyperlink>
-        </w:p>
-        <w:p>
-          <w:pPr>
-            <w:pStyle w:val="TDC1"/>
-            <w:tabs>
-              <w:tab w:val="left" w:pos="440"/>
-              <w:tab w:val="right" w:leader="dot" w:pos="8828"/>
-            </w:tabs>
-            <w:rPr>
-              <w:rFonts w:cstheme="minorBidi"/>
-              <w:noProof/>
-              <w:kern w:val="2"/>
-              <w:sz w:val="24"/>
-              <w:szCs w:val="24"/>
-              <w14:ligatures w14:val="standardContextual"/>
-            </w:rPr>
-          </w:pPr>
-          <w:hyperlink w:anchor="_Toc239453109" w:history="1">
-            <w:r>
-              <w:rPr>
-                <w:rStyle w:val="Hipervnculo"/>
-                <w:rFonts w:ascii="Calibri" w:hAnsi="Calibri" w:cs="Calibri"/>
-                <w:b/>
-                <w:bCs/>
-                <w:iCs/>
-                <w:noProof/>
-              </w:rPr>
-              <w:t>8.</w:t>
-            </w:r>
-            <w:r>
-              <w:rPr>
-                <w:rFonts w:cstheme="minorBidi"/>
-                <w:noProof/>
-                <w:kern w:val="2"/>
-                <w:sz w:val="24"/>
-                <w:szCs w:val="24"/>
-                <w14:ligatures w14:val="standardContextual"/>
-              </w:rPr>
-              <w:tab/>
-            </w:r>
-            <w:r>
-              <w:rPr>
-                <w:rStyle w:val="Hipervnculo"/>
-                <w:rFonts w:ascii="Calibri" w:hAnsi="Calibri" w:cs="Calibri"/>
-                <w:b/>
-                <w:bCs/>
-                <w:noProof/>
-              </w:rPr>
-              <w:t>anexos</w:t>
-            </w:r>
-            <w:r>
-              <w:rPr>
-                <w:noProof/>
-                <w:webHidden/>
-              </w:rPr>
-              <w:tab/>
-            </w:r>
-            <w:r>
-              <w:rPr>
-                <w:noProof/>
-                <w:webHidden/>
-              </w:rPr>
-              <w:fldChar w:fldCharType="begin"/>
-            </w:r>
-            <w:r>
-              <w:rPr>
-                <w:noProof/>
-                <w:webHidden/>
-              </w:rPr>
-              <w:instrText xml:space="preserve"> PAGEREF _Toc239453109 \h </w:instrText>
-            </w:r>
-            <w:r>
-              <w:rPr>
-                <w:noProof/>
-                <w:webHidden/>
-              </w:rPr>
-            </w:r>
-            <w:r>
-              <w:rPr>
-                <w:noProof/>
-                <w:webHidden/>
-              </w:rPr>
-              <w:fldChar w:fldCharType="separate"/>
-            </w:r>
-            <w:r>
-              <w:rPr>
-                <w:noProof/>
-                <w:webHidden/>
-              </w:rPr>
-              <w:t>13</w:t>
+              <w:t>15</w:t>
             </w:r>
             <w:r>
               <w:rPr>
@@ -2279,8 +2517,72 @@
     <w:p/>
     <w:p>
       <w:pPr>
+        <w:pStyle w:val="Ttulo1"/>
+        <w:pBdr>
+          <w:bottom w:val="single" w:sz="12" w:space="1" w:color="D09E00"/>
+        </w:pBdr>
+        <w:rPr>
+          <w:rFonts w:ascii="Calibri" w:hAnsi="Calibri" w:cs="Calibri"/>
+          <w:b/>
+          <w:bCs/>
+        </w:rPr>
+      </w:pPr>
+      <w:bookmarkStart w:id="1" w:name="_Toc239632505"/>
+      <w:r>
+        <w:rPr>
+          <w:rFonts w:ascii="Calibri" w:hAnsi="Calibri" w:cs="Calibri"/>
+          <w:b/>
+          <w:bCs/>
+          <w:sz w:val="28"/>
+          <w:szCs w:val="28"/>
+        </w:rPr>
+        <w:lastRenderedPageBreak/>
+        <w:t>Resumen Ejecutivo</w:t>
+      </w:r>
+      <w:bookmarkEnd w:id="1"/>
+      <w:r>
+        <w:rPr>
+          <w:rFonts w:ascii="Calibri" w:hAnsi="Calibri" w:cs="Calibri"/>
+          <w:b/>
+          <w:bCs/>
+          <w:sz w:val="28"/>
+          <w:szCs w:val="28"/>
+        </w:rPr>
+        <w:t xml:space="preserve"> </w:t>
+      </w:r>
+      <w:r>
+        <w:rPr>
+          <w:rFonts w:ascii="Calibri" w:hAnsi="Calibri" w:cs="Calibri"/>
+          <w:b/>
+          <w:bCs/>
+        </w:rPr>
+        <w:t xml:space="preserve"> </w:t>
+      </w:r>
+    </w:p>
+    <w:p>
+      <w:pPr>
         <w:spacing w:after="160" w:line="278" w:lineRule="auto"/>
       </w:pPr>
+    </w:p>
+    <w:p>
+      <w:pPr>
+        <w:spacing w:after="160" w:line="278" w:lineRule="auto"/>
+      </w:pPr>
+      <w:r>
+        <w:t xml:space="preserve">DPRIME enfrenta un problema estructural en su modelo de negocio: aunque ha ejecutado exitosamente proyectos de automatización para aseguradoras, bancos y operadores logísticos, cada nuevo cliente requiere una solución construida desde cero, lo que limita la escalabilidad. MIRA busca convertir esa experiencia en una plataforma productiva, pero la versión actual es una demostración que no soporta operación autónoma, </w:t>
+      </w:r>
+      <w:r>
+        <w:t>control de versiones</w:t>
+      </w:r>
+      <w:r>
+        <w:t xml:space="preserve"> ni facturación confiable. Este análisis se realizó a partir de nueve entrevistas de levantamiento con el equipo interno y la aseguradora piloto, y arrojó tres hallazgos principales: primero, la plataforma actual no permite operar sin la intervención constante de ingenieros de DPRIME, lo que contradice el modelo de autoservicio prometido; segundo, el motor de análisis no es el cuello de botella, sino la confianza del usuario, la conformidad legal y la calidad de la evidencia de entrada, aspectos que el sistema actual no aborda; tercero, no existe una definición operativa de "validación" ni un registro confiable de uso, lo que inviabiliza el modelo de cobro al éxito. Se recomienda priorizar el desarrollo del diseñador de flujos con </w:t>
+      </w:r>
+      <w:r>
+        <w:t>un control de versiones</w:t>
+      </w:r>
+      <w:r>
+        <w:t>, la bandeja de revisión asistida que muestre explícitamente la razón de derivación, y el módulo de medición de consumo con criterios claros acordados con el cliente piloto, antes de avanzar en capacidades complementarias como análisis de audio o aplicación móvil.</w:t>
+      </w:r>
       <w:r>
         <w:br w:type="page"/>
       </w:r>
@@ -2297,7 +2599,7 @@
           <w:bCs/>
         </w:rPr>
       </w:pPr>
-      <w:bookmarkStart w:id="1" w:name="_Toc239453090"/>
+      <w:bookmarkStart w:id="2" w:name="_Toc239632506"/>
       <w:r>
         <w:rPr>
           <w:rFonts w:ascii="Calibri" w:hAnsi="Calibri" w:cs="Calibri"/>
@@ -2307,27 +2609,9 @@
           <w:szCs w:val="28"/>
         </w:rPr>
         <w:lastRenderedPageBreak/>
-        <w:t>Resumen Ejecutivo</w:t>
-      </w:r>
-      <w:bookmarkEnd w:id="1"/>
-      <w:r>
-        <w:rPr>
-          <w:rFonts w:ascii="Calibri" w:hAnsi="Calibri" w:cs="Calibri"/>
-          <w:b/>
-          <w:bCs/>
-          <w:sz w:val="28"/>
-          <w:szCs w:val="28"/>
-        </w:rPr>
-        <w:t xml:space="preserve"> </w:t>
-      </w:r>
-      <w:r>
-        <w:rPr>
-          <w:rFonts w:ascii="Calibri" w:hAnsi="Calibri" w:cs="Calibri"/>
-          <w:b/>
-          <w:bCs/>
-        </w:rPr>
-        <w:t xml:space="preserve"> </w:t>
-      </w:r>
+        <w:t>Introducción</w:t>
+      </w:r>
+      <w:bookmarkEnd w:id="2"/>
     </w:p>
     <w:p>
       <w:pPr>
@@ -2339,75 +2623,25 @@
         <w:spacing w:after="160" w:line="278" w:lineRule="auto"/>
       </w:pPr>
       <w:r>
-        <w:t xml:space="preserve">DPRIME enfrenta un problema estructural en su modelo de negocio: aunque ha ejecutado exitosamente proyectos de automatización para aseguradoras, bancos y operadores logísticos, cada nuevo cliente requiere una solución construida desde cero, lo que limita la escalabilidad. MIRA busca convertir esa experiencia en una plataforma productiva, pero la versión actual es una demostración que no soporta operación autónoma, </w:t>
-      </w:r>
-      <w:r>
-        <w:t>control de versiones</w:t>
-      </w:r>
-      <w:r>
-        <w:t xml:space="preserve"> ni facturación confiable. Este análisis se realizó a partir de nueve entrevistas de levantamiento con el equipo interno y la aseguradora piloto, y arrojó tres hallazgos principales: primero, la plataforma actual no permite operar sin la intervención constante de ingenieros de DPRIME, lo que contradice el modelo de autoservicio prometido; segundo, el motor de análisis no es el cuello de botella, sino la confianza del usuario, la conformidad legal y la calidad de la evidencia de entrada, aspectos que el sistema actual no aborda; tercero, no existe una definición operativa de "validación" ni un registro confiable de uso, lo que inviabiliza el modelo de cobro al éxito. Se recomienda priorizar el desarrollo del diseñador de flujos con </w:t>
-      </w:r>
-      <w:r>
-        <w:t>un control de versiones</w:t>
-      </w:r>
-      <w:r>
-        <w:t>, la bandeja de revisión asistida que muestre explícitamente la razón de derivación, y el módulo de medición de consumo con criterios claros acordados con el cliente piloto, antes de avanzar en capacidades complementarias como análisis de audio o aplicación móvil.</w:t>
-      </w:r>
-      <w:r>
-        <w:br w:type="page"/>
-      </w:r>
-    </w:p>
-    <w:p>
-      <w:pPr>
-        <w:pStyle w:val="Ttulo1"/>
-        <w:pBdr>
-          <w:bottom w:val="single" w:sz="12" w:space="1" w:color="D09E00"/>
-        </w:pBdr>
-        <w:rPr>
-          <w:rFonts w:ascii="Calibri" w:hAnsi="Calibri" w:cs="Calibri"/>
-          <w:b/>
-          <w:bCs/>
-        </w:rPr>
-      </w:pPr>
-      <w:bookmarkStart w:id="2" w:name="_Toc239453091"/>
-      <w:r>
-        <w:rPr>
-          <w:rFonts w:ascii="Calibri" w:hAnsi="Calibri" w:cs="Calibri"/>
-          <w:b/>
-          <w:bCs/>
-          <w:sz w:val="28"/>
-          <w:szCs w:val="28"/>
-        </w:rPr>
-        <w:lastRenderedPageBreak/>
-        <w:t>Introducción</w:t>
-      </w:r>
-      <w:bookmarkEnd w:id="2"/>
-    </w:p>
-    <w:p>
-      <w:pPr>
-        <w:spacing w:after="160" w:line="278" w:lineRule="auto"/>
-      </w:pPr>
+        <w:t>El presente documento describe la necesidad de construir MIRA, una plataforma de inteligencia artificial multimodal para la toma de decisiones empresariales automatizadas y trazables, desarrollada por DPRIME SpA para los sectores asegurador, financiero y logístico. El análisis se basa en la experiencia acumulada por DPRIME desde 2019 como consultora de automatización y visión computacional, así como en los aprendizajes obtenidos de tres pilotos ejecutados entre 2025 y el primer semestre de 2026. El alcance de este documento corresponde al levantamiento inicial de requerimientos para la versión productiva de MIRA, la cual deberá permitir a los clientes operar la plataforma de forma autónoma, registrar y auditar decisiones, y gestionar la facturación asociada a su uso sin intervención manual.</w:t>
+      </w:r>
       <w:r>
         <w:br/>
       </w:r>
       <w:r>
-        <w:t>El presente documento describe la necesidad de construir MIRA, una plataforma de inteligencia artificial multimodal para la toma de decisiones empresariales automatizadas y trazables, desarrollada por DPRIME SpA para el sector asegurador, financiero y logístico. El análisis se basa en la experiencia acumulada por DPRIME desde 2019 como consultora de automatización y visión computacional, así como en los aprendizajes de tres pilotos ejecutados entre 2025 y el primer semestre de 2026. El alcance de este documento es el levantamiento inicial de requerimientos para la versión productiva de MIRA, que debe permitir a los clientes operar la plataforma de forma autónoma, registrar y auditar decisiones, y facturar el uso sin intervención manual.</w:t>
-      </w:r>
-    </w:p>
-    <w:p>
-      <w:pPr>
-        <w:spacing w:after="160" w:line="278" w:lineRule="auto"/>
-      </w:pPr>
-      <w:r>
-        <w:t>El documento fue redactado por la Dirección de Producto a partir de conversaciones con el equipo interno de DPRIME y con la aseguradora que participa como cliente piloto. El equipo está compuesto por Rodrigo Vergara, socio fundador y gerente general de DPRIME y patrocinador del proyecto; Camila Ordóñez, directora de producto; Sebastián Alarcón, líder de ingeniería de modelos; Valentina Ruiz-Tagle, encargada de administración y finanzas; Tomás Berríos, encargado de operación y soporte; y el equipo de desarrollo. El representante del cliente en esta entrega es Francisca Leiva, subgerenta de operaciones de siniestros de la aseguradora piloto. El análisis parte de la premisa de que este documento describe una necesidad y no una especificación formal de requisitos, y que las discrepancias entre el documento y las entrevistas deben ser resueltas por el equipo de desarrollo.</w:t>
-      </w:r>
-    </w:p>
-    <w:p>
-      <w:pPr>
-        <w:spacing w:after="160" w:line="278" w:lineRule="auto"/>
-      </w:pPr>
-      <w:r>
-        <w:t>El propósito de este documento es establecer un punto de partida para el diseño y construcción de la plataforma MIRA, organizando cuatro entregas entre septiembre de 2026 y abril de 2027, con una marcha blanca programada para el proceso de reembolso de gastos médicos del cliente piloto. La plataforma debe estar disponible de forma permanente, ofrecer un tiempo de respuesta promedio de 2,3 segundos por caso en condiciones óptimas, soportar un volumen inicial estimado de dos mil casos mensuales y manejar evidencia multimodal: documentos, imágenes, video, audio y códigos impresos </w:t>
+        <w:br/>
+      </w:r>
+      <w:r>
+        <w:t>El documento fue elaborado por la Dirección de Producto a partir de conversaciones con el equipo interno de DPRIME y con la aseguradora que participa como cliente piloto. El equipo está compuesto por Rodrigo Vergara, socio fundador y gerente general de DPRIME y patrocinador del proyecto; Camila Ordóñez, directora de producto; Sebastián Alarcón, líder de ingeniería de modelos; Valentina Ruiz-Tagle, encargada de administración y finanzas; Tomás Berríos, encargado de operación y soporte; y el equipo de desarrollo. El representante del cliente en esta entrega es Francisca Leiva, subgerenta de operaciones de siniestros de la aseguradora piloto. Como supuesto general, se considera que este documento representa el levantamiento de una necesidad y no una especificación formal de requisitos. Por ello, las discrepancias identificadas entre el documento y las entrevistas deberán ser validadas y resueltas con los responsables correspondientes antes de formalizar los requisitos.</w:t>
+      </w:r>
+      <w:r>
+        <w:br/>
+      </w:r>
+      <w:r>
+        <w:br/>
+      </w:r>
+      <w:r>
+        <w:t>El propósito de este documento es establecer un punto de partida para el diseño y construcción de la plataforma MIRA mediante el levantamiento inicial de sus requerimientos. El análisis contempla cuatro entregas planificadas entre septiembre de 2026 y abril de 2027, con una marcha blanca programada para el proceso de reembolso de gastos médicos del cliente piloto. Como parte de su alcance inicial, la plataforma deberá considerar disponibilidad permanente, un tiempo de respuesta promedio de 2,3 segundos por caso en condiciones óptimas, un volumen estimado de dos mil casos mensuales y el procesamiento de evidencia multimodal, incluyendo documentos, imágenes, video, audio y códigos impresos.</w:t>
       </w:r>
     </w:p>
     <w:p>
@@ -2431,7 +2665,7 @@
           <w:bCs/>
         </w:rPr>
       </w:pPr>
-      <w:bookmarkStart w:id="3" w:name="_Toc239453092"/>
+      <w:bookmarkStart w:id="3" w:name="_Toc239632507"/>
       <w:r>
         <w:rPr>
           <w:rFonts w:ascii="Calibri" w:hAnsi="Calibri" w:cs="Calibri"/>
@@ -2462,7 +2696,7 @@
           <w:szCs w:val="28"/>
         </w:rPr>
       </w:pPr>
-      <w:bookmarkStart w:id="4" w:name="_Toc239453093"/>
+      <w:bookmarkStart w:id="4" w:name="_Toc239632508"/>
       <w:r>
         <w:rPr>
           <w:rFonts w:ascii="Calibri" w:hAnsi="Calibri" w:cs="Calibri"/>
@@ -2489,7 +2723,7 @@
           <w:szCs w:val="22"/>
         </w:rPr>
       </w:pPr>
-      <w:bookmarkStart w:id="5" w:name="_Toc239453094"/>
+      <w:bookmarkStart w:id="5" w:name="_Toc239632509"/>
       <w:r>
         <w:rPr>
           <w:b/>
@@ -2598,7 +2832,7 @@
           <w:color w:val="1F3864"/>
         </w:rPr>
       </w:pPr>
-      <w:bookmarkStart w:id="6" w:name="_Toc239453095"/>
+      <w:bookmarkStart w:id="6" w:name="_Toc239632510"/>
       <w:r>
         <w:rPr>
           <w:b/>
@@ -4520,7 +4754,7 @@
           <w:szCs w:val="28"/>
         </w:rPr>
       </w:pPr>
-      <w:bookmarkStart w:id="7" w:name="_Toc239453096"/>
+      <w:bookmarkStart w:id="7" w:name="_Toc239632511"/>
       <w:r>
         <w:rPr>
           <w:rFonts w:ascii="Calibri" w:hAnsi="Calibri" w:cs="Calibri"/>
@@ -4593,7 +4827,6 @@
     <w:p/>
     <w:p/>
     <w:p/>
-    <w:p/>
     <w:p>
       <w:pPr>
         <w:pStyle w:val="Ttulo2"/>
@@ -4610,7 +4843,7 @@
           <w:szCs w:val="28"/>
         </w:rPr>
       </w:pPr>
-      <w:bookmarkStart w:id="8" w:name="_Toc239453097"/>
+      <w:bookmarkStart w:id="8" w:name="_Toc239632512"/>
       <w:r>
         <w:rPr>
           <w:rFonts w:ascii="Calibri" w:hAnsi="Calibri" w:cs="Calibri"/>
@@ -6676,7 +6909,7 @@
           <w:szCs w:val="28"/>
         </w:rPr>
       </w:pPr>
-      <w:bookmarkStart w:id="9" w:name="_Toc239453098"/>
+      <w:bookmarkStart w:id="9" w:name="_Toc239632513"/>
       <w:r>
         <w:rPr>
           <w:rFonts w:ascii="Calibri" w:hAnsi="Calibri" w:cs="Calibri"/>
@@ -8426,7 +8659,7 @@
           <w:szCs w:val="28"/>
         </w:rPr>
       </w:pPr>
-      <w:bookmarkStart w:id="10" w:name="_Toc239453099"/>
+      <w:bookmarkStart w:id="10" w:name="_Toc239632514"/>
       <w:r>
         <w:rPr>
           <w:rFonts w:ascii="Calibri" w:hAnsi="Calibri" w:cs="Calibri"/>
@@ -9862,7 +10095,7 @@
           <w:szCs w:val="28"/>
         </w:rPr>
       </w:pPr>
-      <w:bookmarkStart w:id="11" w:name="_Toc239453100"/>
+      <w:bookmarkStart w:id="11" w:name="_Toc239632515"/>
       <w:r>
         <w:rPr>
           <w:rFonts w:ascii="Calibri" w:hAnsi="Calibri" w:cs="Calibri"/>
@@ -10034,23 +10267,7 @@
                 <w:sz w:val="16"/>
                 <w:szCs w:val="16"/>
               </w:rPr>
-              <w:t>RN-?? (</w:t>
-            </w:r>
-            <w:proofErr w:type="spellStart"/>
-            <w:r>
-              <w:rPr>
-                <w:sz w:val="16"/>
-                <w:szCs w:val="16"/>
-              </w:rPr>
-              <w:t>N°</w:t>
-            </w:r>
-            <w:proofErr w:type="spellEnd"/>
-            <w:r>
-              <w:rPr>
-                <w:sz w:val="16"/>
-                <w:szCs w:val="16"/>
-              </w:rPr>
-              <w:t xml:space="preserve"> )</w:t>
+              <w:t>RN-?? (N° )</w:t>
             </w:r>
           </w:p>
         </w:tc>
@@ -10364,11 +10581,13 @@
         <w:ind w:left="567" w:hanging="567"/>
         <w:rPr>
           <w:rFonts w:ascii="Calibri" w:hAnsi="Calibri" w:cs="Calibri"/>
+          <w:b/>
+          <w:bCs/>
           <w:sz w:val="28"/>
           <w:szCs w:val="28"/>
         </w:rPr>
       </w:pPr>
-      <w:bookmarkStart w:id="12" w:name="_Toc239453101"/>
+      <w:bookmarkStart w:id="12" w:name="_Toc239632516"/>
       <w:r>
         <w:rPr>
           <w:rFonts w:ascii="Calibri" w:hAnsi="Calibri" w:cs="Calibri"/>
@@ -10393,16 +10612,7 @@
     </w:p>
     <w:p>
       <w:pPr>
-        <w:pStyle w:val="Ttulo2"/>
-        <w:numPr>
-          <w:ilvl w:val="0"/>
-          <w:numId w:val="0"/>
-        </w:numPr>
-        <w:rPr>
-          <w:rFonts w:ascii="Calibri" w:hAnsi="Calibri" w:cs="Calibri"/>
-          <w:sz w:val="28"/>
-          <w:szCs w:val="28"/>
-        </w:rPr>
+        <w:ind w:left="567"/>
       </w:pPr>
       <w:r>
         <w:rPr>
@@ -10410,7 +10620,7 @@
           <w14:ligatures w14:val="standardContextual"/>
         </w:rPr>
         <w:drawing>
-          <wp:inline distT="0" distB="0" distL="0" distR="0" wp14:anchorId="4B25DA78" wp14:editId="5D36F7CB">
+          <wp:inline distT="0" distB="0" distL="0" distR="0" wp14:anchorId="5857C35C" wp14:editId="11F8AB34">
             <wp:extent cx="5612130" cy="3868420"/>
             <wp:effectExtent l="19050" t="19050" r="26670" b="17780"/>
             <wp:docPr id="174872875" name="Imagen 3"/>
@@ -10456,6 +10666,31 @@
           </wp:inline>
         </w:drawing>
       </w:r>
+    </w:p>
+    <w:p>
+      <w:pPr>
+        <w:pStyle w:val="Ttulo2"/>
+        <w:numPr>
+          <w:ilvl w:val="0"/>
+          <w:numId w:val="0"/>
+        </w:numPr>
+        <w:ind w:left="567"/>
+        <w:rPr>
+          <w:rFonts w:ascii="Calibri" w:hAnsi="Calibri" w:cs="Calibri"/>
+          <w:sz w:val="28"/>
+          <w:szCs w:val="28"/>
+        </w:rPr>
+      </w:pPr>
+      <w:r>
+        <w:rPr>
+          <w:rFonts w:ascii="Calibri" w:hAnsi="Calibri" w:cs="Calibri"/>
+          <w:b/>
+          <w:bCs/>
+          <w:sz w:val="28"/>
+          <w:szCs w:val="28"/>
+        </w:rPr>
+        <w:br/>
+      </w:r>
       <w:r>
         <w:br w:type="page"/>
       </w:r>
@@ -10474,7 +10709,7 @@
           <w:szCs w:val="28"/>
         </w:rPr>
       </w:pPr>
-      <w:bookmarkStart w:id="13" w:name="_Toc239453103"/>
+      <w:bookmarkStart w:id="13" w:name="_Toc239632517"/>
       <w:r>
         <w:rPr>
           <w:rFonts w:ascii="Calibri" w:hAnsi="Calibri" w:cs="Calibri"/>
@@ -10490,14 +10725,1016 @@
     </w:p>
     <w:p>
       <w:pPr>
-        <w:spacing w:after="160" w:line="278" w:lineRule="auto"/>
+        <w:pStyle w:val="Ttulo2"/>
+        <w:numPr>
+          <w:ilvl w:val="0"/>
+          <w:numId w:val="0"/>
+        </w:numPr>
+        <w:spacing w:line="240" w:lineRule="auto"/>
+        <w:ind w:left="714" w:hanging="572"/>
+        <w:rPr>
+          <w:rFonts w:ascii="Calibri" w:hAnsi="Calibri" w:cs="Calibri"/>
+          <w:b/>
+          <w:bCs/>
+          <w:sz w:val="28"/>
+          <w:szCs w:val="28"/>
+        </w:rPr>
       </w:pPr>
+      <w:bookmarkStart w:id="14" w:name="_Toc239632518"/>
+      <w:r>
+        <w:rPr>
+          <w:rFonts w:ascii="Calibri" w:hAnsi="Calibri" w:cs="Calibri"/>
+          <w:b/>
+          <w:bCs/>
+          <w:sz w:val="28"/>
+          <w:szCs w:val="28"/>
+        </w:rPr>
+        <w:t>4.1</w:t>
+      </w:r>
+      <w:r>
+        <w:rPr>
+          <w:rFonts w:ascii="Calibri" w:hAnsi="Calibri" w:cs="Calibri"/>
+          <w:b/>
+          <w:bCs/>
+        </w:rPr>
+        <w:t xml:space="preserve"> </w:t>
+      </w:r>
+      <w:r>
+        <w:rPr>
+          <w:rFonts w:ascii="Calibri" w:hAnsi="Calibri" w:cs="Calibri"/>
+          <w:b/>
+          <w:bCs/>
+          <w:sz w:val="28"/>
+          <w:szCs w:val="28"/>
+        </w:rPr>
+        <w:t>Grounded Prompting</w:t>
+      </w:r>
+      <w:bookmarkEnd w:id="14"/>
     </w:p>
     <w:p>
       <w:pPr>
-        <w:spacing w:after="160" w:line="278" w:lineRule="auto"/>
+        <w:tabs>
+          <w:tab w:val="left" w:pos="284"/>
+        </w:tabs>
+        <w:spacing w:line="240" w:lineRule="auto"/>
+        <w:ind w:left="284" w:hanging="709"/>
+        <w:jc w:val="both"/>
+        <w:rPr>
+          <w:b/>
+          <w:bCs/>
+        </w:rPr>
       </w:pPr>
       <w:r>
+        <w:rPr>
+          <w:b/>
+          <w:bCs/>
+        </w:rPr>
+        <w:tab/>
+        <w:t>Tarea Realizada:</w:t>
+      </w:r>
+      <w:r>
+        <w:rPr>
+          <w:b/>
+          <w:bCs/>
+        </w:rPr>
+        <w:t xml:space="preserve"> </w:t>
+      </w:r>
+      <w:r>
+        <w:t>Redacción del flujo principal y las extensiones de los casos de uso (Fase 4) y extracción en lote del modelo de dominio (Fase 3).</w:t>
+      </w:r>
+    </w:p>
+    <w:p>
+      <w:pPr>
+        <w:tabs>
+          <w:tab w:val="left" w:pos="284"/>
+        </w:tabs>
+        <w:spacing w:line="240" w:lineRule="auto"/>
+        <w:ind w:left="284" w:hanging="141"/>
+        <w:rPr>
+          <w:b/>
+          <w:bCs/>
+        </w:rPr>
+      </w:pPr>
+      <w:r>
+        <w:rPr>
+          <w:b/>
+          <w:bCs/>
+        </w:rPr>
+        <w:tab/>
+        <w:t>Justificación Técnica:</w:t>
+      </w:r>
+      <w:r>
+        <w:rPr>
+          <w:b/>
+          <w:bCs/>
+        </w:rPr>
+        <w:t xml:space="preserve"> </w:t>
+      </w:r>
+      <w:r>
+        <w:t>Obligó al modelo a trabajar únicamente con el inventario de afirmaciones extraídas, impidiendo que completara vacíos con supuestos genéricos sobre "cómo funcionaría normalmente un sistema así"</w:t>
+      </w:r>
+    </w:p>
+    <w:p>
+      <w:pPr>
+        <w:tabs>
+          <w:tab w:val="left" w:pos="284"/>
+        </w:tabs>
+        <w:spacing w:line="240" w:lineRule="auto"/>
+        <w:ind w:left="284" w:hanging="141"/>
+      </w:pPr>
+      <w:r>
+        <w:rPr>
+          <w:b/>
+          <w:bCs/>
+        </w:rPr>
+        <w:tab/>
+        <w:t>Antes:</w:t>
+      </w:r>
+      <w:r>
+        <w:t xml:space="preserve"> </w:t>
+      </w:r>
+      <w:r>
+        <w:t>En un primer intento sin la regla explícita de señalar contradicciones, el modelo redactó un paso asumiendo un umbral de aprobación de 85 puntos, omitiendo completamente otra cifra (80 puntos) presente en la fuente original y ocultando el conflicto</w:t>
+      </w:r>
+    </w:p>
+    <w:p>
+      <w:pPr>
+        <w:tabs>
+          <w:tab w:val="left" w:pos="284"/>
+        </w:tabs>
+        <w:spacing w:line="240" w:lineRule="auto"/>
+        <w:ind w:left="284" w:hanging="142"/>
+      </w:pPr>
+      <w:r>
+        <w:rPr>
+          <w:b/>
+          <w:bCs/>
+        </w:rPr>
+        <w:tab/>
+      </w:r>
+      <w:r>
+        <w:rPr>
+          <w:b/>
+          <w:bCs/>
+        </w:rPr>
+        <w:t>Después</w:t>
+      </w:r>
+      <w:r>
+        <w:rPr>
+          <w:b/>
+          <w:bCs/>
+        </w:rPr>
+        <w:t>:</w:t>
+      </w:r>
+      <w:r>
+        <w:rPr>
+          <w:b/>
+          <w:bCs/>
+        </w:rPr>
+        <w:t xml:space="preserve"> </w:t>
+      </w:r>
+      <w:r>
+        <w:t>Al aplicar reglas estrictas de anclaje, el mismo paso quedó marcado explícitamente como una posible inconsistencia interna no capturada, generando una pregunta pendiente para el representante del cliente en lugar de resolverse automáticamente.</w:t>
+      </w:r>
+    </w:p>
+    <w:p>
+      <w:pPr>
+        <w:tabs>
+          <w:tab w:val="left" w:pos="284"/>
+        </w:tabs>
+        <w:spacing w:line="240" w:lineRule="auto"/>
+        <w:ind w:firstLine="284"/>
+        <w:rPr>
+          <w:b/>
+          <w:bCs/>
+        </w:rPr>
+      </w:pPr>
+      <w:r>
+        <w:rPr>
+          <w:b/>
+          <w:bCs/>
+        </w:rPr>
+        <w:t>Evidencia y referencia</w:t>
+      </w:r>
+      <w:r>
+        <w:rPr>
+          <w:b/>
+          <w:bCs/>
+        </w:rPr>
+        <w:t xml:space="preserve">: </w:t>
+      </w:r>
+      <w:r>
+        <w:t>[</w:t>
+      </w:r>
+      <w:r>
+        <w:t>Anexo – imagen de prompt</w:t>
+      </w:r>
+      <w:r>
+        <w:t>]</w:t>
+      </w:r>
+    </w:p>
+    <w:p>
+      <w:pPr>
+        <w:pStyle w:val="Ttulo2"/>
+        <w:numPr>
+          <w:ilvl w:val="0"/>
+          <w:numId w:val="0"/>
+        </w:numPr>
+        <w:spacing w:line="240" w:lineRule="auto"/>
+        <w:ind w:left="714" w:hanging="572"/>
+        <w:rPr>
+          <w:rFonts w:ascii="Calibri" w:hAnsi="Calibri" w:cs="Calibri"/>
+          <w:b/>
+          <w:bCs/>
+          <w:sz w:val="28"/>
+          <w:szCs w:val="28"/>
+        </w:rPr>
+      </w:pPr>
+      <w:bookmarkStart w:id="15" w:name="_Toc239632519"/>
+      <w:r>
+        <w:rPr>
+          <w:rFonts w:ascii="Calibri" w:hAnsi="Calibri" w:cs="Calibri"/>
+          <w:b/>
+          <w:bCs/>
+          <w:sz w:val="28"/>
+          <w:szCs w:val="28"/>
+        </w:rPr>
+        <w:t xml:space="preserve">4.2 </w:t>
+      </w:r>
+      <w:r>
+        <w:rPr>
+          <w:rFonts w:ascii="Calibri" w:hAnsi="Calibri" w:cs="Calibri"/>
+          <w:b/>
+          <w:bCs/>
+          <w:sz w:val="28"/>
+          <w:szCs w:val="28"/>
+        </w:rPr>
+        <w:t>Structured Output Prompting</w:t>
+      </w:r>
+      <w:bookmarkEnd w:id="15"/>
+    </w:p>
+    <w:p>
+      <w:pPr>
+        <w:spacing w:line="240" w:lineRule="auto"/>
+        <w:ind w:left="284" w:hanging="284"/>
+        <w:rPr>
+          <w:b/>
+          <w:bCs/>
+        </w:rPr>
+      </w:pPr>
+      <w:r>
+        <w:rPr>
+          <w:b/>
+          <w:bCs/>
+        </w:rPr>
+        <w:tab/>
+        <w:t>Tarea Realizada:</w:t>
+      </w:r>
+      <w:r>
+        <w:t xml:space="preserve"> </w:t>
+      </w:r>
+      <w:r>
+        <w:t>Consolidación de las inconsistencias detectadas y generación de la tabla resumen final en formato Markdown (Fase 2)</w:t>
+      </w:r>
+    </w:p>
+    <w:p>
+      <w:pPr>
+        <w:spacing w:line="240" w:lineRule="auto"/>
+        <w:ind w:left="284" w:hanging="142"/>
+        <w:rPr>
+          <w:b/>
+          <w:bCs/>
+        </w:rPr>
+      </w:pPr>
+      <w:r>
+        <w:rPr>
+          <w:b/>
+          <w:bCs/>
+        </w:rPr>
+        <w:tab/>
+        <w:t>Justificación Técnica:</w:t>
+      </w:r>
+      <w:r>
+        <w:rPr>
+          <w:b/>
+          <w:bCs/>
+        </w:rPr>
+        <w:t xml:space="preserve"> </w:t>
+      </w:r>
+      <w:r>
+        <w:t>Forzó un esquema fijo (campos obligatorios como id, grupo</w:t>
+      </w:r>
+      <w:r>
+        <w:t>_</w:t>
+      </w:r>
+      <w:r>
+        <w:t>origen, validado_por_equipo) sobre el contenido existente para estandarizar la salida y dejarla lista para la validación</w:t>
+      </w:r>
+    </w:p>
+    <w:p>
+      <w:pPr>
+        <w:spacing w:line="240" w:lineRule="auto"/>
+        <w:ind w:left="284" w:hanging="567"/>
+        <w:rPr>
+          <w:b/>
+          <w:bCs/>
+        </w:rPr>
+      </w:pPr>
+      <w:r>
+        <w:rPr>
+          <w:b/>
+          <w:bCs/>
+        </w:rPr>
+        <w:tab/>
+        <w:t>Antes:</w:t>
+      </w:r>
+      <w:r>
+        <w:t xml:space="preserve"> </w:t>
+      </w:r>
+      <w:r>
+        <w:t>La interfaz del chat truncaba los identificadores de tiempo porque interpretaba los corchetes como sintaxis nativa de Markdown. Además, un enfoque inicial de tabla "transpuesta" (16 columnas) habría forzado al modelo a recortar párrafos completos para mantener un ancho manejable</w:t>
+      </w:r>
+      <w:r>
+        <w:rPr>
+          <w:b/>
+          <w:bCs/>
+        </w:rPr>
+        <w:t>.</w:t>
+      </w:r>
+    </w:p>
+    <w:p>
+      <w:pPr>
+        <w:spacing w:line="240" w:lineRule="auto"/>
+        <w:ind w:left="284" w:hanging="142"/>
+      </w:pPr>
+      <w:r>
+        <w:rPr>
+          <w:b/>
+          <w:bCs/>
+        </w:rPr>
+        <w:tab/>
+        <w:t>Después</w:t>
+      </w:r>
+      <w:r>
+        <w:t>:</w:t>
+      </w:r>
+      <w:r>
+        <w:t xml:space="preserve"> </w:t>
+      </w:r>
+      <w:r>
+        <w:t>Se ajustó la estructura exigiendo la salida estrictamente dentro de un bloque de código y orientando la tabla con ítems en filas y campos en columnas, preservando la totalidad de los datos largos sin truncamientos</w:t>
+      </w:r>
+    </w:p>
+    <w:p>
+      <w:pPr>
+        <w:spacing w:line="240" w:lineRule="auto"/>
+        <w:ind w:firstLine="284"/>
+        <w:jc w:val="both"/>
+      </w:pPr>
+      <w:r>
+        <w:rPr>
+          <w:b/>
+          <w:bCs/>
+        </w:rPr>
+        <w:t>Evidencia y referencia</w:t>
+      </w:r>
+      <w:r>
+        <w:rPr>
+          <w:b/>
+          <w:bCs/>
+        </w:rPr>
+        <w:t xml:space="preserve">: </w:t>
+      </w:r>
+      <w:r>
+        <w:t>[</w:t>
+      </w:r>
+      <w:r>
+        <w:t>Anexo – imagen de prompt</w:t>
+      </w:r>
+      <w:r>
+        <w:t>]</w:t>
+      </w:r>
+    </w:p>
+    <w:p>
+      <w:pPr>
+        <w:pStyle w:val="Ttulo2"/>
+        <w:numPr>
+          <w:ilvl w:val="0"/>
+          <w:numId w:val="0"/>
+        </w:numPr>
+        <w:spacing w:line="240" w:lineRule="auto"/>
+        <w:ind w:left="714" w:hanging="572"/>
+        <w:rPr>
+          <w:rFonts w:ascii="Calibri" w:hAnsi="Calibri" w:cs="Calibri"/>
+          <w:b/>
+          <w:bCs/>
+          <w:sz w:val="28"/>
+          <w:szCs w:val="28"/>
+        </w:rPr>
+      </w:pPr>
+      <w:bookmarkStart w:id="16" w:name="_Toc239632520"/>
+      <w:r>
+        <w:rPr>
+          <w:rFonts w:ascii="Calibri" w:hAnsi="Calibri" w:cs="Calibri"/>
+          <w:b/>
+          <w:bCs/>
+          <w:sz w:val="28"/>
+          <w:szCs w:val="28"/>
+        </w:rPr>
+        <w:t xml:space="preserve">4.3 </w:t>
+      </w:r>
+      <w:r>
+        <w:rPr>
+          <w:rFonts w:ascii="Calibri" w:hAnsi="Calibri" w:cs="Calibri"/>
+          <w:b/>
+          <w:bCs/>
+          <w:sz w:val="28"/>
+          <w:szCs w:val="28"/>
+        </w:rPr>
+        <w:t>LLM-as-a-Judge</w:t>
+      </w:r>
+      <w:bookmarkEnd w:id="16"/>
+      <w:r>
+        <w:rPr>
+          <w:rFonts w:ascii="Calibri" w:hAnsi="Calibri" w:cs="Calibri"/>
+          <w:b/>
+          <w:bCs/>
+          <w:sz w:val="28"/>
+          <w:szCs w:val="28"/>
+        </w:rPr>
+        <w:t xml:space="preserve"> </w:t>
+      </w:r>
+    </w:p>
+    <w:p>
+      <w:pPr>
+        <w:spacing w:line="240" w:lineRule="auto"/>
+        <w:ind w:left="284" w:hanging="142"/>
+        <w:rPr>
+          <w:b/>
+          <w:bCs/>
+        </w:rPr>
+      </w:pPr>
+      <w:r>
+        <w:rPr>
+          <w:b/>
+          <w:bCs/>
+        </w:rPr>
+        <w:tab/>
+        <w:t>Tarea Realizada:</w:t>
+      </w:r>
+      <w:r>
+        <w:rPr>
+          <w:b/>
+          <w:bCs/>
+        </w:rPr>
+        <w:t xml:space="preserve"> </w:t>
+      </w:r>
+      <w:r>
+        <w:t>Auditoría de la calidad y trazabilidad de los Requisitos No Funcionales (RQNF) generados previamente (Fase 5)</w:t>
+      </w:r>
+    </w:p>
+    <w:p>
+      <w:pPr>
+        <w:spacing w:line="240" w:lineRule="auto"/>
+        <w:ind w:left="284" w:hanging="142"/>
+        <w:rPr>
+          <w:b/>
+          <w:bCs/>
+        </w:rPr>
+      </w:pPr>
+      <w:r>
+        <w:rPr>
+          <w:b/>
+          <w:bCs/>
+        </w:rPr>
+        <w:tab/>
+        <w:t>Justificación Técnica:</w:t>
+      </w:r>
+      <w:r>
+        <w:rPr>
+          <w:b/>
+          <w:bCs/>
+        </w:rPr>
+        <w:t xml:space="preserve"> </w:t>
+      </w:r>
+      <w:r>
+        <w:t>El uso del modelo como juez, evaluando contra una rúbrica estricta de 6 partes (fuente, estímulo, artefacto, entorno, respuesta y medida), aseguró que cada requisito tuviese un criterio de verificación numérico o verificable objetivamente.</w:t>
+      </w:r>
+    </w:p>
+    <w:p>
+      <w:pPr>
+        <w:spacing w:line="240" w:lineRule="auto"/>
+        <w:ind w:left="284" w:hanging="142"/>
+        <w:rPr>
+          <w:b/>
+          <w:bCs/>
+        </w:rPr>
+      </w:pPr>
+      <w:r>
+        <w:rPr>
+          <w:b/>
+          <w:bCs/>
+        </w:rPr>
+        <w:tab/>
+        <w:t>Antes:</w:t>
+      </w:r>
+      <w:r>
+        <w:rPr>
+          <w:b/>
+          <w:bCs/>
+        </w:rPr>
+        <w:t xml:space="preserve"> </w:t>
+      </w:r>
+      <w:r>
+        <w:t>El modelo había dado por válido un requisito ambiguo que indicaba: "El sistema debe procesar los casos de integración de forma asincrónica, sin perder información por caídas."</w:t>
+      </w:r>
+    </w:p>
+    <w:p>
+      <w:pPr>
+        <w:spacing w:line="240" w:lineRule="auto"/>
+        <w:ind w:left="284" w:hanging="284"/>
+        <w:rPr>
+          <w:b/>
+          <w:bCs/>
+        </w:rPr>
+      </w:pPr>
+      <w:r>
+        <w:rPr>
+          <w:b/>
+          <w:bCs/>
+        </w:rPr>
+        <w:lastRenderedPageBreak/>
+        <w:tab/>
+        <w:t>Después:</w:t>
+      </w:r>
+      <w:r>
+        <w:rPr>
+          <w:b/>
+          <w:bCs/>
+        </w:rPr>
+        <w:t xml:space="preserve"> </w:t>
+      </w:r>
+      <w:r>
+        <w:t>Puedo</w:t>
+      </w:r>
+      <w:r>
+        <w:rPr>
+          <w:b/>
+          <w:bCs/>
+        </w:rPr>
+        <w:t xml:space="preserve"> </w:t>
+      </w:r>
+      <w:r>
+        <w:t>detect</w:t>
+      </w:r>
+      <w:r>
+        <w:t>ar</w:t>
+      </w:r>
+      <w:r>
+        <w:t xml:space="preserve"> la carencia métrica y devolvió la alerta explícita: "[NO CUMPLE: falta Entorno y Medida de respuesta numérica]", evitando que el equipo presentara un requisito defectuoso y obligando a definir métricas exactas.</w:t>
+      </w:r>
+      <w:r>
+        <w:rPr>
+          <w:b/>
+          <w:bCs/>
+        </w:rPr>
+        <w:br/>
+      </w:r>
+      <w:r>
+        <w:rPr>
+          <w:b/>
+          <w:bCs/>
+        </w:rPr>
+        <w:br/>
+      </w:r>
+      <w:r>
+        <w:rPr>
+          <w:b/>
+          <w:bCs/>
+        </w:rPr>
+        <w:t>Evidencia</w:t>
+      </w:r>
+      <w:r>
+        <w:rPr>
+          <w:b/>
+          <w:bCs/>
+        </w:rPr>
+        <w:t xml:space="preserve"> y referencia</w:t>
+      </w:r>
+      <w:r>
+        <w:rPr>
+          <w:b/>
+          <w:bCs/>
+        </w:rPr>
+        <w:t xml:space="preserve">: </w:t>
+      </w:r>
+      <w:r>
+        <w:t>[</w:t>
+      </w:r>
+      <w:r>
+        <w:t>Anexo – imagen de prompt</w:t>
+      </w:r>
+      <w:r>
+        <w:t>]</w:t>
+      </w:r>
+    </w:p>
+    <w:p>
+      <w:pPr>
+        <w:pStyle w:val="Ttulo2"/>
+        <w:numPr>
+          <w:ilvl w:val="0"/>
+          <w:numId w:val="0"/>
+        </w:numPr>
+        <w:spacing w:line="240" w:lineRule="auto"/>
+        <w:ind w:left="714" w:hanging="572"/>
+        <w:rPr>
+          <w:rFonts w:ascii="Calibri" w:hAnsi="Calibri" w:cs="Calibri"/>
+          <w:b/>
+          <w:bCs/>
+          <w:sz w:val="28"/>
+          <w:szCs w:val="28"/>
+        </w:rPr>
+      </w:pPr>
+      <w:bookmarkStart w:id="17" w:name="_Toc239632521"/>
+      <w:r>
+        <w:rPr>
+          <w:rFonts w:ascii="Calibri" w:hAnsi="Calibri" w:cs="Calibri"/>
+          <w:b/>
+          <w:bCs/>
+          <w:sz w:val="28"/>
+          <w:szCs w:val="28"/>
+        </w:rPr>
+        <w:t xml:space="preserve">4.4 </w:t>
+      </w:r>
+      <w:r>
+        <w:rPr>
+          <w:rFonts w:ascii="Calibri" w:hAnsi="Calibri" w:cs="Calibri"/>
+          <w:b/>
+          <w:bCs/>
+          <w:sz w:val="28"/>
+          <w:szCs w:val="28"/>
+        </w:rPr>
+        <w:t>Plan-and-Solve Prompting</w:t>
+      </w:r>
+      <w:r>
+        <w:rPr>
+          <w:rFonts w:ascii="Calibri" w:hAnsi="Calibri" w:cs="Calibri"/>
+          <w:b/>
+          <w:bCs/>
+          <w:sz w:val="28"/>
+          <w:szCs w:val="28"/>
+        </w:rPr>
+        <w:t xml:space="preserve"> + </w:t>
+      </w:r>
+      <w:r>
+        <w:rPr>
+          <w:rFonts w:ascii="Calibri" w:hAnsi="Calibri" w:cs="Calibri"/>
+          <w:b/>
+          <w:bCs/>
+          <w:sz w:val="28"/>
+          <w:szCs w:val="28"/>
+        </w:rPr>
+        <w:t>Grounded Prompting</w:t>
+      </w:r>
+      <w:bookmarkEnd w:id="17"/>
+    </w:p>
+    <w:p>
+      <w:pPr>
+        <w:spacing w:line="240" w:lineRule="auto"/>
+        <w:ind w:left="357"/>
+        <w:rPr>
+          <w:b/>
+          <w:bCs/>
+        </w:rPr>
+      </w:pPr>
+      <w:r>
+        <w:rPr>
+          <w:b/>
+          <w:bCs/>
+        </w:rPr>
+        <w:t>Tarea Realizada:</w:t>
+      </w:r>
+      <w:r>
+        <w:rPr>
+          <w:b/>
+          <w:bCs/>
+        </w:rPr>
+        <w:t xml:space="preserve"> </w:t>
+      </w:r>
+      <w:r>
+        <w:t>Selección de los casos de uso candidatos por nivel de riesgo y redacción del flujo extendido de los tres elegidos.</w:t>
+      </w:r>
+    </w:p>
+    <w:p>
+      <w:pPr>
+        <w:spacing w:line="240" w:lineRule="auto"/>
+        <w:ind w:left="357"/>
+        <w:rPr>
+          <w:b/>
+          <w:bCs/>
+        </w:rPr>
+      </w:pPr>
+      <w:r>
+        <w:rPr>
+          <w:b/>
+          <w:bCs/>
+        </w:rPr>
+        <w:t>Justificación Técnica:</w:t>
+      </w:r>
+      <w:r>
+        <w:t xml:space="preserve"> </w:t>
+      </w:r>
+      <w:r>
+        <w:t>Se usó Plan-and-Solve para identificar y ordenar los casos por riesgo sin redactarlos prematuramente, combinado con Grounded Prompting para que la redacción posterior de cada paso se anclara en citas del inventario sin inventar supuestos.</w:t>
+      </w:r>
+    </w:p>
+    <w:p>
+      <w:pPr>
+        <w:spacing w:line="240" w:lineRule="auto"/>
+        <w:ind w:left="357"/>
+        <w:rPr>
+          <w:b/>
+          <w:bCs/>
+        </w:rPr>
+      </w:pPr>
+      <w:r>
+        <w:rPr>
+          <w:b/>
+          <w:bCs/>
+        </w:rPr>
+        <w:t>Antes:</w:t>
+      </w:r>
+      <w:r>
+        <w:t xml:space="preserve"> </w:t>
+      </w:r>
+      <w:r>
+        <w:t>En un primer intento sin la regla estricta de señalar contradicciones, el modelo redactó la aprobación automática asumiendo un solo umbral (85 puntos) y ocultó que existía otra cifra contradictoria en la fuente.</w:t>
+      </w:r>
+    </w:p>
+    <w:p>
+      <w:pPr>
+        <w:spacing w:line="240" w:lineRule="auto"/>
+        <w:ind w:left="357"/>
+        <w:rPr>
+          <w:b/>
+          <w:bCs/>
+        </w:rPr>
+      </w:pPr>
+      <w:r>
+        <w:rPr>
+          <w:b/>
+          <w:bCs/>
+        </w:rPr>
+        <w:t>Después:</w:t>
+      </w:r>
+      <w:r>
+        <w:t xml:space="preserve"> </w:t>
+      </w:r>
+      <w:r>
+        <w:t>Al aplicar explícitamente la regla de contradicciones, el paso conflictivo se marcó correctamente como una "pregunta pendiente" en vez de imprimirse como un hecho ya resuelto.</w:t>
+      </w:r>
+      <w:r>
+        <w:rPr>
+          <w:b/>
+          <w:bCs/>
+        </w:rPr>
+        <w:br/>
+      </w:r>
+      <w:r>
+        <w:rPr>
+          <w:b/>
+          <w:bCs/>
+        </w:rPr>
+        <w:br/>
+      </w:r>
+      <w:r>
+        <w:rPr>
+          <w:b/>
+          <w:bCs/>
+        </w:rPr>
+        <w:t>Evidencia y referencia</w:t>
+      </w:r>
+      <w:r>
+        <w:rPr>
+          <w:b/>
+          <w:bCs/>
+        </w:rPr>
+        <w:t xml:space="preserve">: </w:t>
+      </w:r>
+      <w:r>
+        <w:t>[</w:t>
+      </w:r>
+      <w:r>
+        <w:t>Anexo – imagen de prompt</w:t>
+      </w:r>
+      <w:r>
+        <w:t>]</w:t>
+      </w:r>
+    </w:p>
+    <w:p>
+      <w:pPr>
+        <w:pStyle w:val="Ttulo2"/>
+        <w:numPr>
+          <w:ilvl w:val="0"/>
+          <w:numId w:val="0"/>
+        </w:numPr>
+        <w:spacing w:line="240" w:lineRule="auto"/>
+        <w:ind w:left="714" w:hanging="572"/>
+        <w:rPr>
+          <w:rFonts w:ascii="Calibri" w:hAnsi="Calibri" w:cs="Calibri"/>
+          <w:b/>
+          <w:bCs/>
+          <w:sz w:val="28"/>
+          <w:szCs w:val="28"/>
+        </w:rPr>
+      </w:pPr>
+      <w:bookmarkStart w:id="18" w:name="_Toc239632522"/>
+      <w:r>
+        <w:rPr>
+          <w:rFonts w:ascii="Calibri" w:hAnsi="Calibri" w:cs="Calibri"/>
+          <w:b/>
+          <w:bCs/>
+          <w:sz w:val="28"/>
+          <w:szCs w:val="28"/>
+        </w:rPr>
+        <w:t xml:space="preserve">4.5 </w:t>
+      </w:r>
+      <w:r>
+        <w:rPr>
+          <w:rFonts w:ascii="Calibri" w:hAnsi="Calibri" w:cs="Calibri"/>
+          <w:b/>
+          <w:bCs/>
+          <w:sz w:val="28"/>
+          <w:szCs w:val="28"/>
+        </w:rPr>
+        <w:t>Plan-and-Solve Prompting</w:t>
+      </w:r>
+      <w:bookmarkEnd w:id="18"/>
+    </w:p>
+    <w:p>
+      <w:pPr>
+        <w:spacing w:line="240" w:lineRule="auto"/>
+        <w:ind w:left="357"/>
+        <w:rPr>
+          <w:b/>
+          <w:bCs/>
+        </w:rPr>
+      </w:pPr>
+      <w:r>
+        <w:rPr>
+          <w:b/>
+          <w:bCs/>
+        </w:rPr>
+        <w:t>Tarea Realizada:</w:t>
+      </w:r>
+      <w:r>
+        <w:rPr>
+          <w:b/>
+          <w:bCs/>
+        </w:rPr>
+        <w:t xml:space="preserve"> </w:t>
+      </w:r>
+      <w:r>
+        <w:t>Selección de casos de uso candidatos basándose en su riesgo estimado (Fase 4), priorizando aquellos afectados por hallazgos de inconsistencias previos</w:t>
+      </w:r>
+    </w:p>
+    <w:p>
+      <w:pPr>
+        <w:spacing w:line="240" w:lineRule="auto"/>
+        <w:ind w:left="357"/>
+        <w:rPr>
+          <w:b/>
+          <w:bCs/>
+        </w:rPr>
+      </w:pPr>
+      <w:r>
+        <w:rPr>
+          <w:b/>
+          <w:bCs/>
+        </w:rPr>
+        <w:t>Justificación Técnica:</w:t>
+      </w:r>
+      <w:r>
+        <w:rPr>
+          <w:b/>
+          <w:bCs/>
+        </w:rPr>
+        <w:t xml:space="preserve"> </w:t>
+      </w:r>
+      <w:r>
+        <w:t>Permitió separar la toma de decisiones (selección de casos) de la ejecución (redacción de flujos), evitando el compromiso prematuro con un caso de uso antes de poder comparar todas las opciones disponibles.</w:t>
+      </w:r>
+    </w:p>
+    <w:p>
+      <w:pPr>
+        <w:spacing w:line="240" w:lineRule="auto"/>
+        <w:ind w:left="357"/>
+        <w:rPr>
+          <w:b/>
+          <w:bCs/>
+        </w:rPr>
+      </w:pPr>
+      <w:r>
+        <w:rPr>
+          <w:b/>
+          <w:bCs/>
+        </w:rPr>
+        <w:t>Antes</w:t>
+      </w:r>
+      <w:r>
+        <w:t>:</w:t>
+      </w:r>
+      <w:r>
+        <w:t xml:space="preserve"> </w:t>
+      </w:r>
+      <w:r>
+        <w:t>Sin esta separación entre planificar y resolver, solicitar directamente los casos de uso habría implicado redactar los flujos inmediatamente, forzando un compromiso con casos específicos antes de tener la oportunidad de comparar todos los candidatos entre sí</w:t>
+      </w:r>
+    </w:p>
+    <w:p>
+      <w:pPr>
+        <w:spacing w:line="240" w:lineRule="auto"/>
+        <w:ind w:left="357"/>
+        <w:rPr>
+          <w:b/>
+          <w:bCs/>
+        </w:rPr>
+      </w:pPr>
+      <w:r>
+        <w:rPr>
+          <w:b/>
+          <w:bCs/>
+        </w:rPr>
+        <w:t>Después:</w:t>
+      </w:r>
+      <w:r>
+        <w:rPr>
+          <w:b/>
+          <w:bCs/>
+        </w:rPr>
+        <w:t xml:space="preserve"> </w:t>
+      </w:r>
+      <w:r>
+        <w:t>Al pedir primero solo la lista, el modelo devolvió 11 candidatos, destacando 4 de riesgo "alto". Esto facilitó que el equipo descartara proactivamente casos (como "Diseñar y publicar un flujo") antes de invertir esfuerzo innecesario en su redacción extendida.</w:t>
+      </w:r>
+      <w:r>
+        <w:rPr>
+          <w:b/>
+          <w:bCs/>
+        </w:rPr>
+        <w:br/>
+      </w:r>
+      <w:r>
+        <w:rPr>
+          <w:b/>
+          <w:bCs/>
+        </w:rPr>
+        <w:br/>
+      </w:r>
+      <w:r>
+        <w:rPr>
+          <w:b/>
+          <w:bCs/>
+        </w:rPr>
+        <w:t>Evidencia y referencia</w:t>
+      </w:r>
+      <w:r>
+        <w:rPr>
+          <w:b/>
+          <w:bCs/>
+        </w:rPr>
+        <w:t xml:space="preserve">: </w:t>
+      </w:r>
+      <w:r>
+        <w:t>[</w:t>
+      </w:r>
+      <w:r>
+        <w:t>Anexo – imagen de prompt</w:t>
+      </w:r>
+      <w:r>
+        <w:t>]</w:t>
+      </w:r>
+    </w:p>
+    <w:p>
+      <w:pPr>
+        <w:pStyle w:val="Ttulo2"/>
+        <w:numPr>
+          <w:ilvl w:val="0"/>
+          <w:numId w:val="0"/>
+        </w:numPr>
+        <w:ind w:left="714" w:hanging="357"/>
+        <w:rPr>
+          <w:rFonts w:ascii="Calibri" w:hAnsi="Calibri" w:cs="Calibri"/>
+          <w:b/>
+          <w:bCs/>
+        </w:rPr>
+      </w:pPr>
+      <w:r>
+        <w:rPr>
+          <w:rFonts w:ascii="Calibri" w:hAnsi="Calibri" w:cs="Calibri"/>
+          <w:b/>
+          <w:bCs/>
+        </w:rPr>
         <w:br w:type="page"/>
       </w:r>
     </w:p>
@@ -10515,7 +11752,7 @@
           <w:szCs w:val="28"/>
         </w:rPr>
       </w:pPr>
-      <w:bookmarkStart w:id="14" w:name="_Toc239453104"/>
+      <w:bookmarkStart w:id="19" w:name="_Toc239632523"/>
       <w:r>
         <w:rPr>
           <w:rFonts w:ascii="Calibri" w:hAnsi="Calibri" w:cs="Calibri"/>
@@ -10527,7 +11764,7 @@
         <w:lastRenderedPageBreak/>
         <w:t>Inconsistencias detectadas y su resolución</w:t>
       </w:r>
-      <w:bookmarkEnd w:id="14"/>
+      <w:bookmarkEnd w:id="19"/>
       <w:r>
         <w:rPr>
           <w:rFonts w:ascii="Calibri" w:hAnsi="Calibri" w:cs="Calibri"/>
@@ -10556,7 +11793,7 @@
           <w:szCs w:val="22"/>
         </w:rPr>
       </w:pPr>
-      <w:bookmarkStart w:id="15" w:name="_Toc239453105"/>
+      <w:bookmarkStart w:id="20" w:name="_Toc239632524"/>
       <w:r>
         <w:rPr>
           <w:rFonts w:ascii="Calibri" w:hAnsi="Calibri" w:cs="Calibri"/>
@@ -10568,7 +11805,7 @@
         </w:rPr>
         <w:t>5.1 Inconsistencias resueltas</w:t>
       </w:r>
-      <w:bookmarkEnd w:id="15"/>
+      <w:bookmarkEnd w:id="20"/>
     </w:p>
     <w:tbl>
       <w:tblPr>
@@ -10997,14 +12234,7 @@
                 <w:sz w:val="16"/>
                 <w:szCs w:val="16"/>
               </w:rPr>
-              <w:t>H-0</w:t>
-            </w:r>
-            <w:r>
-              <w:rPr>
-                <w:sz w:val="16"/>
-                <w:szCs w:val="16"/>
-              </w:rPr>
-              <w:t>2</w:t>
+              <w:t>H-02</w:t>
             </w:r>
           </w:p>
         </w:tc>
@@ -11178,14 +12408,7 @@
                 <w:sz w:val="16"/>
                 <w:szCs w:val="16"/>
               </w:rPr>
-              <w:t>H-0</w:t>
-            </w:r>
-            <w:r>
-              <w:rPr>
-                <w:sz w:val="16"/>
-                <w:szCs w:val="16"/>
-              </w:rPr>
-              <w:t>3</w:t>
+              <w:t>H-03</w:t>
             </w:r>
           </w:p>
         </w:tc>
@@ -11311,39 +12534,7 @@
                 <w:sz w:val="16"/>
                 <w:szCs w:val="16"/>
               </w:rPr>
-              <w:t>Se define un modo de carga por lote (</w:t>
-            </w:r>
-            <w:proofErr w:type="spellStart"/>
-            <w:r>
-              <w:rPr>
-                <w:sz w:val="16"/>
-                <w:szCs w:val="16"/>
-              </w:rPr>
-              <w:t>bulk</w:t>
-            </w:r>
-            <w:proofErr w:type="spellEnd"/>
-            <w:r>
-              <w:rPr>
-                <w:sz w:val="16"/>
-                <w:szCs w:val="16"/>
-              </w:rPr>
-              <w:t xml:space="preserve">) con límite propio para cargas masivas predecibles (histórico inicial, catch-up tras caídas). Para tráfico estándar, exceso de límite = rechazo con cabecera </w:t>
-            </w:r>
-            <w:proofErr w:type="spellStart"/>
-            <w:r>
-              <w:rPr>
-                <w:sz w:val="16"/>
-                <w:szCs w:val="16"/>
-              </w:rPr>
-              <w:t>Retry</w:t>
-            </w:r>
-            <w:proofErr w:type="spellEnd"/>
-            <w:r>
-              <w:rPr>
-                <w:sz w:val="16"/>
-                <w:szCs w:val="16"/>
-              </w:rPr>
-              <w:t>-After.</w:t>
+              <w:t>Se define un modo de carga por lote (bulk) con límite propio para cargas masivas predecibles (histórico inicial, catch-up tras caídas). Para tráfico estándar, exceso de límite = rechazo con cabecera Retry-After.</w:t>
             </w:r>
           </w:p>
         </w:tc>
@@ -11400,14 +12591,7 @@
                 <w:sz w:val="16"/>
                 <w:szCs w:val="16"/>
               </w:rPr>
-              <w:t>H-0</w:t>
-            </w:r>
-            <w:r>
-              <w:rPr>
-                <w:sz w:val="16"/>
-                <w:szCs w:val="16"/>
-              </w:rPr>
-              <w:t>4</w:t>
+              <w:t>H-04</w:t>
             </w:r>
           </w:p>
         </w:tc>
@@ -11581,14 +12765,7 @@
                 <w:sz w:val="16"/>
                 <w:szCs w:val="16"/>
               </w:rPr>
-              <w:t>H-0</w:t>
-            </w:r>
-            <w:r>
-              <w:rPr>
-                <w:sz w:val="16"/>
-                <w:szCs w:val="16"/>
-              </w:rPr>
-              <w:t>5</w:t>
+              <w:t>H-05</w:t>
             </w:r>
           </w:p>
         </w:tc>
@@ -11764,14 +12941,7 @@
                 <w:sz w:val="16"/>
                 <w:szCs w:val="16"/>
               </w:rPr>
-              <w:t>H-0</w:t>
-            </w:r>
-            <w:r>
-              <w:rPr>
-                <w:sz w:val="16"/>
-                <w:szCs w:val="16"/>
-              </w:rPr>
-              <w:t>6</w:t>
+              <w:t>H-06</w:t>
             </w:r>
           </w:p>
         </w:tc>
@@ -11945,14 +13115,7 @@
                 <w:sz w:val="16"/>
                 <w:szCs w:val="16"/>
               </w:rPr>
-              <w:t>H-0</w:t>
-            </w:r>
-            <w:r>
-              <w:rPr>
-                <w:sz w:val="16"/>
-                <w:szCs w:val="16"/>
-              </w:rPr>
-              <w:t>7</w:t>
+              <w:t>H-07</w:t>
             </w:r>
           </w:p>
         </w:tc>
@@ -12446,7 +13609,7 @@
               </w:rPr>
               <w:t xml:space="preserve">Se cobra una validación por caso, salvo que exista evidencia nueva sustantiva que gatille un </w:t>
             </w:r>
-            <w:bookmarkStart w:id="16" w:name="_Int_L8h7j53o"/>
+            <w:bookmarkStart w:id="21" w:name="_Int_L8h7j53o"/>
             <w:r>
               <w:rPr>
                 <w:sz w:val="16"/>
@@ -12454,7 +13617,7 @@
               </w:rPr>
               <w:t>reanálisis completo</w:t>
             </w:r>
-            <w:bookmarkEnd w:id="16"/>
+            <w:bookmarkEnd w:id="21"/>
             <w:r>
               <w:rPr>
                 <w:sz w:val="16"/>
@@ -12744,14 +13907,7 @@
                 <w:sz w:val="18"/>
                 <w:szCs w:val="18"/>
               </w:rPr>
-              <w:t>H-</w:t>
-            </w:r>
-            <w:r>
-              <w:rPr>
-                <w:sz w:val="18"/>
-                <w:szCs w:val="18"/>
-              </w:rPr>
-              <w:t>10</w:t>
+              <w:t>H-10</w:t>
             </w:r>
           </w:p>
         </w:tc>
@@ -12925,14 +14081,7 @@
                 <w:sz w:val="18"/>
                 <w:szCs w:val="18"/>
               </w:rPr>
-              <w:t>H-</w:t>
-            </w:r>
-            <w:r>
-              <w:rPr>
-                <w:sz w:val="18"/>
-                <w:szCs w:val="18"/>
-              </w:rPr>
-              <w:t>11</w:t>
+              <w:t>H-11</w:t>
             </w:r>
           </w:p>
         </w:tc>
@@ -13107,14 +14256,7 @@
                 <w:sz w:val="18"/>
                 <w:szCs w:val="18"/>
               </w:rPr>
-              <w:t>H-</w:t>
-            </w:r>
-            <w:r>
-              <w:rPr>
-                <w:sz w:val="18"/>
-                <w:szCs w:val="18"/>
-              </w:rPr>
-              <w:t>12</w:t>
+              <w:t>H-12</w:t>
             </w:r>
           </w:p>
         </w:tc>
@@ -13288,14 +14430,7 @@
                 <w:sz w:val="18"/>
                 <w:szCs w:val="18"/>
               </w:rPr>
-              <w:t>H-1</w:t>
-            </w:r>
-            <w:r>
-              <w:rPr>
-                <w:sz w:val="18"/>
-                <w:szCs w:val="18"/>
-              </w:rPr>
-              <w:t>3</w:t>
+              <w:t>H-13</w:t>
             </w:r>
           </w:p>
         </w:tc>
@@ -13353,23 +14488,7 @@
                 <w:sz w:val="16"/>
                 <w:szCs w:val="16"/>
               </w:rPr>
-              <w:t xml:space="preserve">§2.10 (integración mediante llamadas en línea y envío de evidencia en la misma llamada), §4 (intercambio de archivos en carpeta compartida mediante procesos periódicos), ENT7 [00:01:06] (sistema central sin servicios web; integración mediante intercambio de archivos; las llamadas en línea contra el </w:t>
-            </w:r>
-            <w:proofErr w:type="spellStart"/>
-            <w:r>
-              <w:rPr>
-                <w:sz w:val="16"/>
-                <w:szCs w:val="16"/>
-              </w:rPr>
-              <w:t>core</w:t>
-            </w:r>
-            <w:proofErr w:type="spellEnd"/>
-            <w:r>
-              <w:rPr>
-                <w:sz w:val="16"/>
-                <w:szCs w:val="16"/>
-              </w:rPr>
-              <w:t xml:space="preserve"> no funcionarían)</w:t>
+              <w:t>§2.10 (integración mediante llamadas en línea y envío de evidencia en la misma llamada), §4 (intercambio de archivos en carpeta compartida mediante procesos periódicos), ENT7 [00:01:06] (sistema central sin servicios web; integración mediante intercambio de archivos; las llamadas en línea contra el core no funcionarían)</w:t>
             </w:r>
           </w:p>
         </w:tc>
@@ -13427,23 +14546,7 @@
                 <w:sz w:val="16"/>
                 <w:szCs w:val="16"/>
               </w:rPr>
-              <w:t xml:space="preserve">La plataforma soporta ambos patrones de integración: API REST para clientes que la expongan, e intercambio de archivos para clientes cuyo </w:t>
-            </w:r>
-            <w:proofErr w:type="spellStart"/>
-            <w:r>
-              <w:rPr>
-                <w:sz w:val="16"/>
-                <w:szCs w:val="16"/>
-              </w:rPr>
-              <w:t>core</w:t>
-            </w:r>
-            <w:proofErr w:type="spellEnd"/>
-            <w:r>
-              <w:rPr>
-                <w:sz w:val="16"/>
-                <w:szCs w:val="16"/>
-              </w:rPr>
-              <w:t xml:space="preserve"> no expone servicios web (caso del cliente piloto).</w:t>
+              <w:t>La plataforma soporta ambos patrones de integración: API REST para clientes que la expongan, e intercambio de archivos para clientes cuyo core no expone servicios web (caso del cliente piloto).</w:t>
             </w:r>
           </w:p>
         </w:tc>
@@ -13502,14 +14605,7 @@
                 <w:sz w:val="18"/>
                 <w:szCs w:val="18"/>
               </w:rPr>
-              <w:t>H-1</w:t>
-            </w:r>
-            <w:r>
-              <w:rPr>
-                <w:sz w:val="18"/>
-                <w:szCs w:val="18"/>
-              </w:rPr>
-              <w:t>4</w:t>
+              <w:t>H-14</w:t>
             </w:r>
           </w:p>
         </w:tc>
@@ -13683,14 +14779,7 @@
                 <w:sz w:val="18"/>
                 <w:szCs w:val="18"/>
               </w:rPr>
-              <w:t>H-1</w:t>
-            </w:r>
-            <w:r>
-              <w:rPr>
-                <w:sz w:val="18"/>
-                <w:szCs w:val="18"/>
-              </w:rPr>
-              <w:t>5</w:t>
+              <w:t>H-15</w:t>
             </w:r>
           </w:p>
         </w:tc>
@@ -13865,14 +14954,7 @@
                 <w:sz w:val="18"/>
                 <w:szCs w:val="18"/>
               </w:rPr>
-              <w:t>H-1</w:t>
-            </w:r>
-            <w:r>
-              <w:rPr>
-                <w:sz w:val="18"/>
-                <w:szCs w:val="18"/>
-              </w:rPr>
-              <w:t>6</w:t>
+              <w:t>H-16</w:t>
             </w:r>
           </w:p>
         </w:tc>
@@ -14080,7 +15162,7 @@
           <w:szCs w:val="28"/>
         </w:rPr>
       </w:pPr>
-      <w:bookmarkStart w:id="17" w:name="_Toc239453107"/>
+      <w:bookmarkStart w:id="22" w:name="_Toc239632525"/>
       <w:r>
         <w:rPr>
           <w:rFonts w:ascii="Calibri" w:hAnsi="Calibri" w:cs="Calibri"/>
@@ -14092,7 +15174,7 @@
         <w:lastRenderedPageBreak/>
         <w:t>Discusión</w:t>
       </w:r>
-      <w:bookmarkEnd w:id="17"/>
+      <w:bookmarkEnd w:id="22"/>
     </w:p>
     <w:p>
       <w:pPr>
@@ -14247,7 +15329,7 @@
           <w:szCs w:val="28"/>
         </w:rPr>
       </w:pPr>
-      <w:bookmarkStart w:id="18" w:name="_Toc239453108"/>
+      <w:bookmarkStart w:id="23" w:name="_Toc239632526"/>
       <w:r>
         <w:rPr>
           <w:rFonts w:ascii="Calibri" w:hAnsi="Calibri" w:cs="Calibri"/>
@@ -14259,7 +15341,7 @@
         <w:lastRenderedPageBreak/>
         <w:t>Conclusiones</w:t>
       </w:r>
-      <w:bookmarkEnd w:id="18"/>
+      <w:bookmarkEnd w:id="23"/>
     </w:p>
     <w:p>
       <w:pPr>
@@ -14283,7 +15365,7 @@
           <w:szCs w:val="28"/>
         </w:rPr>
       </w:pPr>
-      <w:bookmarkStart w:id="19" w:name="_Toc239453109"/>
+      <w:bookmarkStart w:id="24" w:name="_Toc239632527"/>
       <w:r>
         <w:rPr>
           <w:rFonts w:ascii="Calibri" w:hAnsi="Calibri" w:cs="Calibri"/>
@@ -14305,7 +15387,7 @@
         </w:rPr>
         <w:t>nexos</w:t>
       </w:r>
-      <w:bookmarkEnd w:id="19"/>
+      <w:bookmarkEnd w:id="24"/>
     </w:p>
     <w:p>
       <w:pPr>
@@ -14533,7 +15615,6 @@
                 <w:szCs w:val="16"/>
               </w:rPr>
             </w:pPr>
-            <w:proofErr w:type="spellStart"/>
             <w:r>
               <w:rPr>
                 <w:sz w:val="16"/>
@@ -14541,7 +15622,6 @@
               </w:rPr>
               <w:t>xx-xx-xxxx</w:t>
             </w:r>
-            <w:proofErr w:type="spellEnd"/>
           </w:p>
         </w:tc>
       </w:tr>
@@ -15028,7 +16108,7 @@
           <wp:extent cx="1367155" cy="649605"/>
           <wp:effectExtent l="0" t="0" r="0" b="0"/>
           <wp:wrapNone/>
-          <wp:docPr id="1876538826" name="image1.jpg" descr="Graphical user interface&#10;&#10;Description automatically generated with low confidence"/>
+          <wp:docPr id="551833488" name="image1.jpg" descr="Graphical user interface&#10;&#10;Description automatically generated with low confidence"/>
           <wp:cNvGraphicFramePr/>
           <a:graphic xmlns:a="http://schemas.openxmlformats.org/drawingml/2006/main">
             <a:graphicData uri="http://schemas.openxmlformats.org/drawingml/2006/picture">
@@ -15176,7 +16256,7 @@
           <wp:extent cx="1767205" cy="645160"/>
           <wp:effectExtent l="0" t="0" r="0" b="0"/>
           <wp:wrapNone/>
-          <wp:docPr id="858070443" name="image3.png" descr="Text, logo&#10;&#10;Description automatically generated"/>
+          <wp:docPr id="49685104" name="image3.png" descr="Text, logo&#10;&#10;Description automatically generated"/>
           <wp:cNvGraphicFramePr/>
           <a:graphic xmlns:a="http://schemas.openxmlformats.org/drawingml/2006/main">
             <a:graphicData uri="http://schemas.openxmlformats.org/drawingml/2006/picture">
@@ -15546,6 +16626,232 @@
     </w:lvl>
   </w:abstractNum>
   <w:abstractNum w:abstractNumId="3" w15:restartNumberingAfterBreak="0">
+    <w:nsid w:val="129E64A3"/>
+    <w:multiLevelType w:val="hybridMultilevel"/>
+    <w:tmpl w:val="2C58B092"/>
+    <w:lvl w:ilvl="0" w:tplc="340A0001">
+      <w:start w:val="1"/>
+      <w:numFmt w:val="bullet"/>
+      <w:lvlText w:val=""/>
+      <w:lvlJc w:val="left"/>
+      <w:pPr>
+        <w:ind w:left="4314" w:hanging="360"/>
+      </w:pPr>
+      <w:rPr>
+        <w:rFonts w:ascii="Symbol" w:hAnsi="Symbol" w:hint="default"/>
+      </w:rPr>
+    </w:lvl>
+    <w:lvl w:ilvl="1" w:tplc="340A0003" w:tentative="1">
+      <w:start w:val="1"/>
+      <w:numFmt w:val="bullet"/>
+      <w:lvlText w:val="o"/>
+      <w:lvlJc w:val="left"/>
+      <w:pPr>
+        <w:ind w:left="5034" w:hanging="360"/>
+      </w:pPr>
+      <w:rPr>
+        <w:rFonts w:ascii="Courier New" w:hAnsi="Courier New" w:cs="Courier New" w:hint="default"/>
+      </w:rPr>
+    </w:lvl>
+    <w:lvl w:ilvl="2" w:tplc="340A0005" w:tentative="1">
+      <w:start w:val="1"/>
+      <w:numFmt w:val="bullet"/>
+      <w:lvlText w:val=""/>
+      <w:lvlJc w:val="left"/>
+      <w:pPr>
+        <w:ind w:left="5754" w:hanging="360"/>
+      </w:pPr>
+      <w:rPr>
+        <w:rFonts w:ascii="Wingdings" w:hAnsi="Wingdings" w:hint="default"/>
+      </w:rPr>
+    </w:lvl>
+    <w:lvl w:ilvl="3" w:tplc="340A0001" w:tentative="1">
+      <w:start w:val="1"/>
+      <w:numFmt w:val="bullet"/>
+      <w:lvlText w:val=""/>
+      <w:lvlJc w:val="left"/>
+      <w:pPr>
+        <w:ind w:left="6474" w:hanging="360"/>
+      </w:pPr>
+      <w:rPr>
+        <w:rFonts w:ascii="Symbol" w:hAnsi="Symbol" w:hint="default"/>
+      </w:rPr>
+    </w:lvl>
+    <w:lvl w:ilvl="4" w:tplc="340A0003" w:tentative="1">
+      <w:start w:val="1"/>
+      <w:numFmt w:val="bullet"/>
+      <w:lvlText w:val="o"/>
+      <w:lvlJc w:val="left"/>
+      <w:pPr>
+        <w:ind w:left="7194" w:hanging="360"/>
+      </w:pPr>
+      <w:rPr>
+        <w:rFonts w:ascii="Courier New" w:hAnsi="Courier New" w:cs="Courier New" w:hint="default"/>
+      </w:rPr>
+    </w:lvl>
+    <w:lvl w:ilvl="5" w:tplc="340A0005" w:tentative="1">
+      <w:start w:val="1"/>
+      <w:numFmt w:val="bullet"/>
+      <w:lvlText w:val=""/>
+      <w:lvlJc w:val="left"/>
+      <w:pPr>
+        <w:ind w:left="7914" w:hanging="360"/>
+      </w:pPr>
+      <w:rPr>
+        <w:rFonts w:ascii="Wingdings" w:hAnsi="Wingdings" w:hint="default"/>
+      </w:rPr>
+    </w:lvl>
+    <w:lvl w:ilvl="6" w:tplc="340A0001" w:tentative="1">
+      <w:start w:val="1"/>
+      <w:numFmt w:val="bullet"/>
+      <w:lvlText w:val=""/>
+      <w:lvlJc w:val="left"/>
+      <w:pPr>
+        <w:ind w:left="8634" w:hanging="360"/>
+      </w:pPr>
+      <w:rPr>
+        <w:rFonts w:ascii="Symbol" w:hAnsi="Symbol" w:hint="default"/>
+      </w:rPr>
+    </w:lvl>
+    <w:lvl w:ilvl="7" w:tplc="340A0003" w:tentative="1">
+      <w:start w:val="1"/>
+      <w:numFmt w:val="bullet"/>
+      <w:lvlText w:val="o"/>
+      <w:lvlJc w:val="left"/>
+      <w:pPr>
+        <w:ind w:left="9354" w:hanging="360"/>
+      </w:pPr>
+      <w:rPr>
+        <w:rFonts w:ascii="Courier New" w:hAnsi="Courier New" w:cs="Courier New" w:hint="default"/>
+      </w:rPr>
+    </w:lvl>
+    <w:lvl w:ilvl="8" w:tplc="340A0005" w:tentative="1">
+      <w:start w:val="1"/>
+      <w:numFmt w:val="bullet"/>
+      <w:lvlText w:val=""/>
+      <w:lvlJc w:val="left"/>
+      <w:pPr>
+        <w:ind w:left="10074" w:hanging="360"/>
+      </w:pPr>
+      <w:rPr>
+        <w:rFonts w:ascii="Wingdings" w:hAnsi="Wingdings" w:hint="default"/>
+      </w:rPr>
+    </w:lvl>
+  </w:abstractNum>
+  <w:abstractNum w:abstractNumId="4" w15:restartNumberingAfterBreak="0">
+    <w:nsid w:val="26CF08AB"/>
+    <w:multiLevelType w:val="hybridMultilevel"/>
+    <w:tmpl w:val="4FC81ADA"/>
+    <w:lvl w:ilvl="0" w:tplc="340A0001">
+      <w:start w:val="1"/>
+      <w:numFmt w:val="bullet"/>
+      <w:lvlText w:val=""/>
+      <w:lvlJc w:val="left"/>
+      <w:pPr>
+        <w:ind w:left="3600" w:hanging="360"/>
+      </w:pPr>
+      <w:rPr>
+        <w:rFonts w:ascii="Symbol" w:hAnsi="Symbol" w:hint="default"/>
+      </w:rPr>
+    </w:lvl>
+    <w:lvl w:ilvl="1" w:tplc="340A0003" w:tentative="1">
+      <w:start w:val="1"/>
+      <w:numFmt w:val="bullet"/>
+      <w:lvlText w:val="o"/>
+      <w:lvlJc w:val="left"/>
+      <w:pPr>
+        <w:ind w:left="4320" w:hanging="360"/>
+      </w:pPr>
+      <w:rPr>
+        <w:rFonts w:ascii="Courier New" w:hAnsi="Courier New" w:cs="Courier New" w:hint="default"/>
+      </w:rPr>
+    </w:lvl>
+    <w:lvl w:ilvl="2" w:tplc="340A0005" w:tentative="1">
+      <w:start w:val="1"/>
+      <w:numFmt w:val="bullet"/>
+      <w:lvlText w:val=""/>
+      <w:lvlJc w:val="left"/>
+      <w:pPr>
+        <w:ind w:left="5040" w:hanging="360"/>
+      </w:pPr>
+      <w:rPr>
+        <w:rFonts w:ascii="Wingdings" w:hAnsi="Wingdings" w:hint="default"/>
+      </w:rPr>
+    </w:lvl>
+    <w:lvl w:ilvl="3" w:tplc="340A0001" w:tentative="1">
+      <w:start w:val="1"/>
+      <w:numFmt w:val="bullet"/>
+      <w:lvlText w:val=""/>
+      <w:lvlJc w:val="left"/>
+      <w:pPr>
+        <w:ind w:left="5760" w:hanging="360"/>
+      </w:pPr>
+      <w:rPr>
+        <w:rFonts w:ascii="Symbol" w:hAnsi="Symbol" w:hint="default"/>
+      </w:rPr>
+    </w:lvl>
+    <w:lvl w:ilvl="4" w:tplc="340A0003" w:tentative="1">
+      <w:start w:val="1"/>
+      <w:numFmt w:val="bullet"/>
+      <w:lvlText w:val="o"/>
+      <w:lvlJc w:val="left"/>
+      <w:pPr>
+        <w:ind w:left="6480" w:hanging="360"/>
+      </w:pPr>
+      <w:rPr>
+        <w:rFonts w:ascii="Courier New" w:hAnsi="Courier New" w:cs="Courier New" w:hint="default"/>
+      </w:rPr>
+    </w:lvl>
+    <w:lvl w:ilvl="5" w:tplc="340A0005" w:tentative="1">
+      <w:start w:val="1"/>
+      <w:numFmt w:val="bullet"/>
+      <w:lvlText w:val=""/>
+      <w:lvlJc w:val="left"/>
+      <w:pPr>
+        <w:ind w:left="7200" w:hanging="360"/>
+      </w:pPr>
+      <w:rPr>
+        <w:rFonts w:ascii="Wingdings" w:hAnsi="Wingdings" w:hint="default"/>
+      </w:rPr>
+    </w:lvl>
+    <w:lvl w:ilvl="6" w:tplc="340A0001" w:tentative="1">
+      <w:start w:val="1"/>
+      <w:numFmt w:val="bullet"/>
+      <w:lvlText w:val=""/>
+      <w:lvlJc w:val="left"/>
+      <w:pPr>
+        <w:ind w:left="7920" w:hanging="360"/>
+      </w:pPr>
+      <w:rPr>
+        <w:rFonts w:ascii="Symbol" w:hAnsi="Symbol" w:hint="default"/>
+      </w:rPr>
+    </w:lvl>
+    <w:lvl w:ilvl="7" w:tplc="340A0003" w:tentative="1">
+      <w:start w:val="1"/>
+      <w:numFmt w:val="bullet"/>
+      <w:lvlText w:val="o"/>
+      <w:lvlJc w:val="left"/>
+      <w:pPr>
+        <w:ind w:left="8640" w:hanging="360"/>
+      </w:pPr>
+      <w:rPr>
+        <w:rFonts w:ascii="Courier New" w:hAnsi="Courier New" w:cs="Courier New" w:hint="default"/>
+      </w:rPr>
+    </w:lvl>
+    <w:lvl w:ilvl="8" w:tplc="340A0005" w:tentative="1">
+      <w:start w:val="1"/>
+      <w:numFmt w:val="bullet"/>
+      <w:lvlText w:val=""/>
+      <w:lvlJc w:val="left"/>
+      <w:pPr>
+        <w:ind w:left="9360" w:hanging="360"/>
+      </w:pPr>
+      <w:rPr>
+        <w:rFonts w:ascii="Wingdings" w:hAnsi="Wingdings" w:hint="default"/>
+      </w:rPr>
+    </w:lvl>
+  </w:abstractNum>
+  <w:abstractNum w:abstractNumId="5" w15:restartNumberingAfterBreak="0">
     <w:nsid w:val="30212DF1"/>
     <w:multiLevelType w:val="hybridMultilevel"/>
     <w:tmpl w:val="42F8B366"/>
@@ -15659,7 +16965,7 @@
       </w:rPr>
     </w:lvl>
   </w:abstractNum>
-  <w:abstractNum w:abstractNumId="4" w15:restartNumberingAfterBreak="0">
+  <w:abstractNum w:abstractNumId="6" w15:restartNumberingAfterBreak="0">
     <w:nsid w:val="4C0F1690"/>
     <w:multiLevelType w:val="multilevel"/>
     <w:tmpl w:val="340A001D"/>
@@ -15745,7 +17051,7 @@
       </w:pPr>
     </w:lvl>
   </w:abstractNum>
-  <w:abstractNum w:abstractNumId="5" w15:restartNumberingAfterBreak="0">
+  <w:abstractNum w:abstractNumId="7" w15:restartNumberingAfterBreak="0">
     <w:nsid w:val="581D17B3"/>
     <w:multiLevelType w:val="multilevel"/>
     <w:tmpl w:val="4CBC40BA"/>
@@ -15867,7 +17173,7 @@
       </w:rPr>
     </w:lvl>
   </w:abstractNum>
-  <w:abstractNum w:abstractNumId="6" w15:restartNumberingAfterBreak="0">
+  <w:abstractNum w:abstractNumId="8" w15:restartNumberingAfterBreak="0">
     <w:nsid w:val="62371D09"/>
     <w:multiLevelType w:val="multilevel"/>
     <w:tmpl w:val="340A001F"/>
@@ -15953,10 +17259,10 @@
       </w:pPr>
     </w:lvl>
   </w:abstractNum>
-  <w:abstractNum w:abstractNumId="7" w15:restartNumberingAfterBreak="0">
+  <w:abstractNum w:abstractNumId="9" w15:restartNumberingAfterBreak="0">
     <w:nsid w:val="714F4097"/>
     <w:multiLevelType w:val="multilevel"/>
-    <w:tmpl w:val="8D9C0142"/>
+    <w:tmpl w:val="77A20244"/>
     <w:styleLink w:val="Estilo1"/>
     <w:lvl w:ilvl="0">
       <w:start w:val="1"/>
@@ -16077,14 +17383,127 @@
       </w:rPr>
     </w:lvl>
   </w:abstractNum>
+  <w:abstractNum w:abstractNumId="10" w15:restartNumberingAfterBreak="0">
+    <w:nsid w:val="7AE56E84"/>
+    <w:multiLevelType w:val="hybridMultilevel"/>
+    <w:tmpl w:val="F6D83C90"/>
+    <w:lvl w:ilvl="0" w:tplc="340A0001">
+      <w:start w:val="1"/>
+      <w:numFmt w:val="bullet"/>
+      <w:lvlText w:val=""/>
+      <w:lvlJc w:val="left"/>
+      <w:pPr>
+        <w:ind w:left="720" w:hanging="360"/>
+      </w:pPr>
+      <w:rPr>
+        <w:rFonts w:ascii="Symbol" w:hAnsi="Symbol" w:hint="default"/>
+      </w:rPr>
+    </w:lvl>
+    <w:lvl w:ilvl="1" w:tplc="340A0003" w:tentative="1">
+      <w:start w:val="1"/>
+      <w:numFmt w:val="bullet"/>
+      <w:lvlText w:val="o"/>
+      <w:lvlJc w:val="left"/>
+      <w:pPr>
+        <w:ind w:left="1440" w:hanging="360"/>
+      </w:pPr>
+      <w:rPr>
+        <w:rFonts w:ascii="Courier New" w:hAnsi="Courier New" w:cs="Courier New" w:hint="default"/>
+      </w:rPr>
+    </w:lvl>
+    <w:lvl w:ilvl="2" w:tplc="340A0005" w:tentative="1">
+      <w:start w:val="1"/>
+      <w:numFmt w:val="bullet"/>
+      <w:lvlText w:val=""/>
+      <w:lvlJc w:val="left"/>
+      <w:pPr>
+        <w:ind w:left="2160" w:hanging="360"/>
+      </w:pPr>
+      <w:rPr>
+        <w:rFonts w:ascii="Wingdings" w:hAnsi="Wingdings" w:hint="default"/>
+      </w:rPr>
+    </w:lvl>
+    <w:lvl w:ilvl="3" w:tplc="340A0001" w:tentative="1">
+      <w:start w:val="1"/>
+      <w:numFmt w:val="bullet"/>
+      <w:lvlText w:val=""/>
+      <w:lvlJc w:val="left"/>
+      <w:pPr>
+        <w:ind w:left="2880" w:hanging="360"/>
+      </w:pPr>
+      <w:rPr>
+        <w:rFonts w:ascii="Symbol" w:hAnsi="Symbol" w:hint="default"/>
+      </w:rPr>
+    </w:lvl>
+    <w:lvl w:ilvl="4" w:tplc="340A0003" w:tentative="1">
+      <w:start w:val="1"/>
+      <w:numFmt w:val="bullet"/>
+      <w:lvlText w:val="o"/>
+      <w:lvlJc w:val="left"/>
+      <w:pPr>
+        <w:ind w:left="3600" w:hanging="360"/>
+      </w:pPr>
+      <w:rPr>
+        <w:rFonts w:ascii="Courier New" w:hAnsi="Courier New" w:cs="Courier New" w:hint="default"/>
+      </w:rPr>
+    </w:lvl>
+    <w:lvl w:ilvl="5" w:tplc="340A0005" w:tentative="1">
+      <w:start w:val="1"/>
+      <w:numFmt w:val="bullet"/>
+      <w:lvlText w:val=""/>
+      <w:lvlJc w:val="left"/>
+      <w:pPr>
+        <w:ind w:left="4320" w:hanging="360"/>
+      </w:pPr>
+      <w:rPr>
+        <w:rFonts w:ascii="Wingdings" w:hAnsi="Wingdings" w:hint="default"/>
+      </w:rPr>
+    </w:lvl>
+    <w:lvl w:ilvl="6" w:tplc="340A0001" w:tentative="1">
+      <w:start w:val="1"/>
+      <w:numFmt w:val="bullet"/>
+      <w:lvlText w:val=""/>
+      <w:lvlJc w:val="left"/>
+      <w:pPr>
+        <w:ind w:left="5040" w:hanging="360"/>
+      </w:pPr>
+      <w:rPr>
+        <w:rFonts w:ascii="Symbol" w:hAnsi="Symbol" w:hint="default"/>
+      </w:rPr>
+    </w:lvl>
+    <w:lvl w:ilvl="7" w:tplc="340A0003" w:tentative="1">
+      <w:start w:val="1"/>
+      <w:numFmt w:val="bullet"/>
+      <w:lvlText w:val="o"/>
+      <w:lvlJc w:val="left"/>
+      <w:pPr>
+        <w:ind w:left="5760" w:hanging="360"/>
+      </w:pPr>
+      <w:rPr>
+        <w:rFonts w:ascii="Courier New" w:hAnsi="Courier New" w:cs="Courier New" w:hint="default"/>
+      </w:rPr>
+    </w:lvl>
+    <w:lvl w:ilvl="8" w:tplc="340A0005" w:tentative="1">
+      <w:start w:val="1"/>
+      <w:numFmt w:val="bullet"/>
+      <w:lvlText w:val=""/>
+      <w:lvlJc w:val="left"/>
+      <w:pPr>
+        <w:ind w:left="6480" w:hanging="360"/>
+      </w:pPr>
+      <w:rPr>
+        <w:rFonts w:ascii="Wingdings" w:hAnsi="Wingdings" w:hint="default"/>
+      </w:rPr>
+    </w:lvl>
+  </w:abstractNum>
   <w:num w:numId="1" w16cid:durableId="828862074">
     <w:abstractNumId w:val="0"/>
   </w:num>
   <w:num w:numId="2" w16cid:durableId="678775131">
-    <w:abstractNumId w:val="6"/>
+    <w:abstractNumId w:val="8"/>
   </w:num>
   <w:num w:numId="3" w16cid:durableId="443814940">
-    <w:abstractNumId w:val="7"/>
+    <w:abstractNumId w:val="9"/>
     <w:lvlOverride w:ilvl="0">
       <w:lvl w:ilvl="0">
         <w:start w:val="1"/>
@@ -16109,13 +17528,13 @@
     </w:lvlOverride>
   </w:num>
   <w:num w:numId="4" w16cid:durableId="1167288674">
-    <w:abstractNumId w:val="4"/>
+    <w:abstractNumId w:val="6"/>
   </w:num>
   <w:num w:numId="5" w16cid:durableId="254673929">
-    <w:abstractNumId w:val="5"/>
+    <w:abstractNumId w:val="7"/>
   </w:num>
   <w:num w:numId="6" w16cid:durableId="345711229">
-    <w:abstractNumId w:val="7"/>
+    <w:abstractNumId w:val="9"/>
   </w:num>
   <w:num w:numId="7" w16cid:durableId="1440296409">
     <w:abstractNumId w:val="2"/>
@@ -16124,7 +17543,28 @@
     <w:abstractNumId w:val="1"/>
   </w:num>
   <w:num w:numId="9" w16cid:durableId="684748345">
+    <w:abstractNumId w:val="5"/>
+  </w:num>
+  <w:num w:numId="10" w16cid:durableId="1314523806">
     <w:abstractNumId w:val="3"/>
+  </w:num>
+  <w:num w:numId="11" w16cid:durableId="1682197713">
+    <w:abstractNumId w:val="4"/>
+  </w:num>
+  <w:num w:numId="12" w16cid:durableId="308823407">
+    <w:abstractNumId w:val="10"/>
+  </w:num>
+  <w:num w:numId="13" w16cid:durableId="1675494998">
+    <w:abstractNumId w:val="5"/>
+    <w:lvlOverride w:ilvl="0"/>
+    <w:lvlOverride w:ilvl="1"/>
+    <w:lvlOverride w:ilvl="2"/>
+    <w:lvlOverride w:ilvl="3"/>
+    <w:lvlOverride w:ilvl="4"/>
+    <w:lvlOverride w:ilvl="5"/>
+    <w:lvlOverride w:ilvl="6"/>
+    <w:lvlOverride w:ilvl="7"/>
+    <w:lvlOverride w:ilvl="8"/>
   </w:num>
 </w:numbering>
 </file>
@@ -16753,7 +18193,6 @@
   <w:style w:type="character" w:default="1" w:styleId="Fuentedeprrafopredeter">
     <w:name w:val="Default Paragraph Font"/>
     <w:uiPriority w:val="1"/>
-    <w:semiHidden/>
     <w:unhideWhenUsed/>
   </w:style>
   <w:style w:type="table" w:default="1" w:styleId="Tablanormal">
@@ -17370,6 +18809,23 @@
       <w14:ligatures w14:val="none"/>
     </w:rPr>
   </w:style>
+  <w:style w:type="paragraph" w:styleId="NormalWeb">
+    <w:name w:val="Normal (Web)"/>
+    <w:basedOn w:val="Normal"/>
+    <w:uiPriority w:val="99"/>
+    <w:semiHidden/>
+    <w:unhideWhenUsed/>
+    <w:rsid w:val="00B81B59"/>
+    <w:pPr>
+      <w:spacing w:before="100" w:beforeAutospacing="1" w:after="100" w:afterAutospacing="1" w:line="240" w:lineRule="auto"/>
+    </w:pPr>
+    <w:rPr>
+      <w:rFonts w:ascii="Times New Roman" w:eastAsia="Times New Roman" w:hAnsi="Times New Roman" w:cs="Times New Roman"/>
+      <w:sz w:val="24"/>
+      <w:szCs w:val="24"/>
+      <w:lang w:eastAsia="ja-JP"/>
+    </w:rPr>
+  </w:style>
 </w:styles>
 </file>
 

</xml_diff>